<commit_message>
Padroniza equações, figuras e quadros dos manuscritos da Seção 1
</commit_message>
<xml_diff>
--- a/secoes/01_Recurso_Solar/producao/manuscritos/1_2_Grandezas_Radiometricas.docx
+++ b/secoes/01_Recurso_Solar/producao/manuscritos/1_2_Grandezas_Radiometricas.docx
@@ -6,11 +6,18 @@
     <w:p>
       <w:pPr>
         <w:pStyle w:val="Heading1"/>
+        <w:keepNext/>
         <w:widowControl/>
+        <w:spacing w:line="360" w:lineRule="auto" w:after="120"/>
+        <w:ind w:firstLine="0"/>
       </w:pPr>
       <w:r>
         <w:rPr>
+          <w:rFonts w:ascii="Times New Roman" w:hAnsi="Times New Roman"/>
           <w:b/>
+          <w:i w:val="0"/>
+          <w:color w:val="000000"/>
+          <w:sz w:val="24"/>
         </w:rPr>
         <w:t>1.2 GRANDEZAS RADIOMÉTRICAS E COMPONENTES DA RADIAÇÃO</w:t>
       </w:r>
@@ -19,11 +26,18 @@
     <w:p>
       <w:pPr>
         <w:pStyle w:val="Heading2"/>
+        <w:keepNext/>
         <w:widowControl/>
+        <w:spacing w:line="360" w:lineRule="auto" w:after="120"/>
+        <w:ind w:firstLine="0"/>
       </w:pPr>
       <w:r>
         <w:rPr>
+          <w:rFonts w:ascii="Times New Roman" w:hAnsi="Times New Roman"/>
           <w:b/>
+          <w:i w:val="0"/>
+          <w:color w:val="000000"/>
+          <w:sz w:val="24"/>
         </w:rPr>
         <w:t>1.2.1 IRRADIÂNCIA E IRRADIAÇÃO</w:t>
       </w:r>
@@ -32,11 +46,15 @@
       <w:pPr>
         <w:pStyle w:val="FirstParagraph"/>
         <w:widowControl/>
+        <w:spacing w:line="360" w:lineRule="auto" w:after="120"/>
+        <w:ind w:firstLine="709"/>
       </w:pPr>
       <w:r>
         <w:rPr>
           <w:rFonts w:ascii="Times New Roman" w:hAnsi="Times New Roman"/>
           <w:i w:val="0"/>
+          <w:color w:val="000000"/>
+          <w:sz w:val="24"/>
         </w:rPr>
         <w:t xml:space="preserve">A descrição do recurso solar exige identificar a grandeza física, o plano de referência e o intervalo temporal a que cada valor se refere. A irradiância corresponde à potência radiante incidente por unidade de área, expressa em watt por metro quadrado (W/m²). A irradiação representa a energia radiante recebida por unidade de área durante um intervalo definido, expressa no Sistema Internacional em joule por metro quadrado (J/m²). O uso de Wh/m² ou kWh/m² é conveniente em aplicações energéticas, desde que o intervalo de integração seja explicitado. Assim, irradiância e irradiação descrevem aspectos relacionados do recurso, mas não podem ser substituídas uma pela outra em equações ou eixos gráficos (DUFFIE; BECKMAN; BLAIR, 2020, p. 10).</w:t>
       </w:r>
@@ -44,29 +62,180 @@
     <w:p>
       <w:pPr>
         <w:pStyle w:val="BodyText"/>
+        <w:keepNext/>
         <w:widowControl/>
+        <w:spacing w:line="360" w:lineRule="auto" w:after="120"/>
+        <w:ind w:firstLine="709"/>
       </w:pPr>
       <w:r>
-        <w:rPr>
-          <w:rFonts w:ascii="Times New Roman" w:hAnsi="Times New Roman"/>
-          <w:i w:val="0"/>
-        </w:rPr>
-        <w:t xml:space="preserve">Se</w:t>
-      </w:r>
-      <w:r>
-        <w:rPr>
-          <w:rFonts w:ascii="Times New Roman" w:hAnsi="Times New Roman"/>
-          <w:i w:val="0"/>
-        </w:rPr>
-        <w:t xml:space="preserve"> </w:t>
+        <w:t>A irradiação recebida no plano e intervalo considerados é obtida pela integração temporal da irradiância, conforme a equação (1):</w:t>
+      </w:r>
+    </w:p>
+    <w:p>
+      <w:pPr>
+        <w:keepNext/>
+        <w:keepLines/>
+        <w:widowControl/>
+        <w:tabs>
+          <w:tab w:pos="4535" w:val="center"/>
+          <w:tab w:pos="9071" w:val="right"/>
+        </w:tabs>
+        <w:spacing w:before="160" w:after="160" w:line="276" w:lineRule="auto"/>
+        <w:ind w:firstLine="0" w:left="0" w:right="0"/>
+        <w:jc w:val="left"/>
+      </w:pPr>
+      <w:r>
+        <w:rPr>
+          <w:rFonts w:ascii="Times New Roman" w:hAnsi="Times New Roman"/>
+          <w:sz w:val="24"/>
+        </w:rPr>
+        <w:tab/>
       </w:r>
       <m:oMath>
-        <m:r>
-          <w:rPr>
-            <w:sz w:val="28"/>
-          </w:rPr>
-          <m:t>G</m:t>
-        </m:r>
+        <m:sSub>
+          <m:e>
+            <m:r>
+              <w:rPr>
+                <w:sz w:val="24"/>
+                <w:szCs w:val="24"/>
+              </w:rPr>
+              <m:t>H</m:t>
+            </m:r>
+          </m:e>
+          <m:sub>
+            <m:d>
+              <m:dPr>
+                <m:begChr m:val="["/>
+                <m:endChr m:val="]"/>
+                <m:sepChr m:val=""/>
+                <m:grow/>
+              </m:dPr>
+              <m:e>
+                <m:sSub>
+                  <m:e>
+                    <m:r>
+                      <w:rPr>
+                        <w:sz w:val="24"/>
+                        <w:szCs w:val="24"/>
+                      </w:rPr>
+                      <m:t>t</m:t>
+                    </m:r>
+                  </m:e>
+                  <m:sub>
+                    <m:r>
+                      <w:rPr>
+                        <w:sz w:val="24"/>
+                        <w:szCs w:val="24"/>
+                      </w:rPr>
+                      <m:t>1</m:t>
+                    </m:r>
+                  </m:sub>
+                </m:sSub>
+                <m:r>
+                  <m:rPr>
+                    <m:sty m:val="p"/>
+                  </m:rPr>
+                  <w:rPr>
+                    <w:sz w:val="24"/>
+                    <w:szCs w:val="24"/>
+                  </w:rPr>
+                  <m:t>,</m:t>
+                </m:r>
+                <m:sSub>
+                  <m:e>
+                    <m:r>
+                      <w:rPr>
+                        <w:sz w:val="24"/>
+                        <w:szCs w:val="24"/>
+                      </w:rPr>
+                      <m:t>t</m:t>
+                    </m:r>
+                  </m:e>
+                  <m:sub>
+                    <m:r>
+                      <w:rPr>
+                        <w:sz w:val="24"/>
+                        <w:szCs w:val="24"/>
+                      </w:rPr>
+                      <m:t>2</m:t>
+                    </m:r>
+                  </m:sub>
+                </m:sSub>
+              </m:e>
+            </m:d>
+          </m:sub>
+        </m:sSub>
+        <m:r>
+          <m:rPr>
+            <m:sty m:val="p"/>
+          </m:rPr>
+          <w:rPr>
+            <w:sz w:val="24"/>
+            <w:szCs w:val="24"/>
+          </w:rPr>
+          <m:t>=</m:t>
+        </m:r>
+        <m:nary>
+          <m:naryPr>
+            <m:chr m:val="∫"/>
+            <m:limLoc m:val="subSup"/>
+            <m:subHide m:val="off"/>
+            <m:supHide m:val="off"/>
+          </m:naryPr>
+          <m:sub>
+            <m:sSub>
+              <m:e>
+                <m:r>
+                  <w:rPr>
+                    <w:sz w:val="24"/>
+                    <w:szCs w:val="24"/>
+                  </w:rPr>
+                  <m:t>t</m:t>
+                </m:r>
+              </m:e>
+              <m:sub>
+                <m:r>
+                  <w:rPr>
+                    <w:sz w:val="24"/>
+                    <w:szCs w:val="24"/>
+                  </w:rPr>
+                  <m:t>1</m:t>
+                </m:r>
+              </m:sub>
+            </m:sSub>
+          </m:sub>
+          <m:sup>
+            <m:sSub>
+              <m:e>
+                <m:r>
+                  <w:rPr>
+                    <w:sz w:val="24"/>
+                    <w:szCs w:val="24"/>
+                  </w:rPr>
+                  <m:t>t</m:t>
+                </m:r>
+              </m:e>
+              <m:sub>
+                <m:r>
+                  <w:rPr>
+                    <w:sz w:val="24"/>
+                    <w:szCs w:val="24"/>
+                  </w:rPr>
+                  <m:t>2</m:t>
+                </m:r>
+              </m:sub>
+            </m:sSub>
+          </m:sup>
+          <m:e>
+            <m:r>
+              <w:rPr>
+                <w:sz w:val="24"/>
+                <w:szCs w:val="24"/>
+              </w:rPr>
+              <m:t>G</m:t>
+            </m:r>
+          </m:e>
+        </m:nary>
         <m:d>
           <m:dPr>
             <m:begChr m:val="("/>
@@ -77,7 +246,311 @@
           <m:e>
             <m:r>
               <w:rPr>
-                <w:sz w:val="28"/>
+                <w:sz w:val="24"/>
+                <w:szCs w:val="24"/>
+              </w:rPr>
+              <m:t>t</m:t>
+            </m:r>
+          </m:e>
+        </m:d>
+        <m:r>
+          <w:rPr>
+            <w:sz w:val="24"/>
+            <w:szCs w:val="24"/>
+          </w:rPr>
+          <m:t> </m:t>
+        </m:r>
+        <m:r>
+          <m:rPr>
+            <m:sty m:val="p"/>
+          </m:rPr>
+          <w:rPr>
+            <w:sz w:val="24"/>
+            <w:szCs w:val="24"/>
+          </w:rPr>
+          <m:t>d</m:t>
+        </m:r>
+        <m:r>
+          <w:rPr>
+            <w:sz w:val="24"/>
+            <w:szCs w:val="24"/>
+          </w:rPr>
+          <m:t>t</m:t>
+        </m:r>
+        <m:r>
+          <m:rPr>
+            <m:sty m:val="p"/>
+          </m:rPr>
+          <w:rPr>
+            <w:sz w:val="24"/>
+            <w:szCs w:val="24"/>
+          </w:rPr>
+          <m:t>.</m:t>
+        </m:r>
+      </m:oMath>
+      <w:r>
+        <w:rPr>
+          <w:rFonts w:ascii="Times New Roman" w:hAnsi="Times New Roman"/>
+          <w:sz w:val="24"/>
+        </w:rPr>
+        <w:tab/>
+        <w:t>(</w:t>
+      </w:r>
+      <w:bookmarkStart w:id="701" w:name="Equacao_integral"/>
+      <w:fldSimple w:instr=" SEQ Equacao \* ARABIC ">
+        <w:r>
+          <w:rPr>
+            <w:sz w:val="24"/>
+          </w:rPr>
+          <w:t>1</w:t>
+        </w:r>
+      </w:fldSimple>
+      <w:bookmarkEnd w:id="701"/>
+      <w:r>
+        <w:rPr>
+          <w:rFonts w:ascii="Times New Roman" w:hAnsi="Times New Roman"/>
+          <w:sz w:val="24"/>
+        </w:rPr>
+        <w:t>)</w:t>
+      </w:r>
+    </w:p>
+    <w:p>
+      <w:pPr>
+        <w:pStyle w:val="BodyText"/>
+        <w:widowControl/>
+        <w:spacing w:line="360" w:lineRule="auto" w:after="120"/>
+        <w:ind w:firstLine="709"/>
+        <w:jc w:val="both"/>
+      </w:pPr>
+      <w:r>
+        <w:rPr>
+          <w:rFonts w:ascii="Times New Roman" w:hAnsi="Times New Roman"/>
+          <w:i w:val="0"/>
+          <w:color w:val="000000"/>
+          <w:sz w:val="24"/>
+        </w:rPr>
+        <w:t xml:space="preserve">em que</w:t>
+      </w:r>
+      <w:r>
+        <w:rPr>
+          <w:rFonts w:ascii="Times New Roman" w:hAnsi="Times New Roman"/>
+          <w:i w:val="0"/>
+          <w:color w:val="000000"/>
+          <w:sz w:val="24"/>
+        </w:rPr>
+        <w:t xml:space="preserve"> </w:t>
+      </w:r>
+      <m:oMath>
+        <m:sSub>
+          <m:e>
+            <m:r>
+              <w:rPr>
+                <w:sz w:val="24"/>
+                <w:szCs w:val="24"/>
+              </w:rPr>
+              <m:t>H</m:t>
+            </m:r>
+          </m:e>
+          <m:sub>
+            <m:d>
+              <m:dPr>
+                <m:begChr m:val="["/>
+                <m:endChr m:val="]"/>
+                <m:sepChr m:val=""/>
+                <m:grow/>
+              </m:dPr>
+              <m:e>
+                <m:sSub>
+                  <m:e>
+                    <m:r>
+                      <w:rPr>
+                        <w:sz w:val="24"/>
+                        <w:szCs w:val="24"/>
+                      </w:rPr>
+                      <m:t>t</m:t>
+                    </m:r>
+                  </m:e>
+                  <m:sub>
+                    <m:r>
+                      <w:rPr>
+                        <w:sz w:val="24"/>
+                        <w:szCs w:val="24"/>
+                      </w:rPr>
+                      <m:t>1</m:t>
+                    </m:r>
+                  </m:sub>
+                </m:sSub>
+                <m:r>
+                  <m:rPr>
+                    <m:sty m:val="p"/>
+                  </m:rPr>
+                  <w:rPr>
+                    <w:sz w:val="24"/>
+                    <w:szCs w:val="24"/>
+                  </w:rPr>
+                  <m:t>,</m:t>
+                </m:r>
+                <m:sSub>
+                  <m:e>
+                    <m:r>
+                      <w:rPr>
+                        <w:sz w:val="24"/>
+                        <w:szCs w:val="24"/>
+                      </w:rPr>
+                      <m:t>t</m:t>
+                    </m:r>
+                  </m:e>
+                  <m:sub>
+                    <m:r>
+                      <w:rPr>
+                        <w:sz w:val="24"/>
+                        <w:szCs w:val="24"/>
+                      </w:rPr>
+                      <m:t>2</m:t>
+                    </m:r>
+                  </m:sub>
+                </m:sSub>
+              </m:e>
+            </m:d>
+          </m:sub>
+        </m:sSub>
+      </m:oMath>
+      <w:r>
+        <w:rPr>
+          <w:rFonts w:ascii="Times New Roman" w:hAnsi="Times New Roman"/>
+          <w:i w:val="0"/>
+          <w:color w:val="000000"/>
+          <w:sz w:val="24"/>
+        </w:rPr>
+        <w:t xml:space="preserve"> </w:t>
+      </w:r>
+      <w:r>
+        <w:rPr>
+          <w:rFonts w:ascii="Times New Roman" w:hAnsi="Times New Roman"/>
+          <w:i w:val="0"/>
+          <w:color w:val="000000"/>
+          <w:sz w:val="24"/>
+        </w:rPr>
+        <w:t xml:space="preserve">é a irradiação acumulada no plano considerado entre os limites</w:t>
+      </w:r>
+      <w:r>
+        <w:rPr>
+          <w:rFonts w:ascii="Times New Roman" w:hAnsi="Times New Roman"/>
+          <w:i w:val="0"/>
+          <w:color w:val="000000"/>
+          <w:sz w:val="24"/>
+        </w:rPr>
+        <w:t xml:space="preserve"> </w:t>
+      </w:r>
+      <m:oMath>
+        <m:sSub>
+          <m:e>
+            <m:r>
+              <w:rPr>
+                <w:sz w:val="24"/>
+                <w:szCs w:val="24"/>
+              </w:rPr>
+              <m:t>t</m:t>
+            </m:r>
+          </m:e>
+          <m:sub>
+            <m:r>
+              <w:rPr>
+                <w:sz w:val="24"/>
+                <w:szCs w:val="24"/>
+              </w:rPr>
+              <m:t>1</m:t>
+            </m:r>
+          </m:sub>
+        </m:sSub>
+      </m:oMath>
+      <w:r>
+        <w:rPr>
+          <w:rFonts w:ascii="Times New Roman" w:hAnsi="Times New Roman"/>
+          <w:i w:val="0"/>
+          <w:color w:val="000000"/>
+          <w:sz w:val="24"/>
+        </w:rPr>
+        <w:t xml:space="preserve"> </w:t>
+      </w:r>
+      <w:r>
+        <w:rPr>
+          <w:rFonts w:ascii="Times New Roman" w:hAnsi="Times New Roman"/>
+          <w:i w:val="0"/>
+          <w:color w:val="000000"/>
+          <w:sz w:val="24"/>
+        </w:rPr>
+        <w:t xml:space="preserve">e</w:t>
+      </w:r>
+      <w:r>
+        <w:rPr>
+          <w:rFonts w:ascii="Times New Roman" w:hAnsi="Times New Roman"/>
+          <w:i w:val="0"/>
+          <w:color w:val="000000"/>
+          <w:sz w:val="24"/>
+        </w:rPr>
+        <w:t xml:space="preserve"> </w:t>
+      </w:r>
+      <m:oMath>
+        <m:sSub>
+          <m:e>
+            <m:r>
+              <w:rPr>
+                <w:sz w:val="24"/>
+                <w:szCs w:val="24"/>
+              </w:rPr>
+              <m:t>t</m:t>
+            </m:r>
+          </m:e>
+          <m:sub>
+            <m:r>
+              <w:rPr>
+                <w:sz w:val="24"/>
+                <w:szCs w:val="24"/>
+              </w:rPr>
+              <m:t>2</m:t>
+            </m:r>
+          </m:sub>
+        </m:sSub>
+      </m:oMath>
+      <w:r>
+        <w:rPr>
+          <w:rFonts w:ascii="Times New Roman" w:hAnsi="Times New Roman"/>
+          <w:i w:val="0"/>
+          <w:color w:val="000000"/>
+          <w:sz w:val="24"/>
+        </w:rPr>
+        <w:t xml:space="preserve">;</w:t>
+      </w:r>
+      <w:r>
+        <w:rPr>
+          <w:rFonts w:ascii="Times New Roman" w:hAnsi="Times New Roman"/>
+          <w:i w:val="0"/>
+          <w:color w:val="000000"/>
+          <w:sz w:val="24"/>
+        </w:rPr>
+        <w:t xml:space="preserve"> </w:t>
+      </w:r>
+      <m:oMath>
+        <m:r>
+          <w:rPr>
+            <w:sz w:val="24"/>
+            <w:szCs w:val="24"/>
+          </w:rPr>
+          <m:t>G</m:t>
+        </m:r>
+        <m:d>
+          <m:dPr>
+            <m:begChr m:val="("/>
+            <m:endChr m:val=")"/>
+            <m:sepChr m:val=""/>
+            <m:grow/>
+          </m:dPr>
+          <m:e>
+            <m:r>
+              <w:rPr>
+                <w:sz w:val="24"/>
+                <w:szCs w:val="24"/>
               </w:rPr>
               <m:t>t</m:t>
             </m:r>
@@ -88,6 +561,8 @@
         <w:rPr>
           <w:rFonts w:ascii="Times New Roman" w:hAnsi="Times New Roman"/>
           <w:i w:val="0"/>
+          <w:color w:val="000000"/>
+          <w:sz w:val="24"/>
         </w:rPr>
         <w:t xml:space="preserve"> </w:t>
       </w:r>
@@ -95,22 +570,451 @@
         <w:rPr>
           <w:rFonts w:ascii="Times New Roman" w:hAnsi="Times New Roman"/>
           <w:i w:val="0"/>
-        </w:rPr>
-        <w:t xml:space="preserve">representa a irradiância no plano considerado, a irradiação entre os instantes</w:t>
-      </w:r>
-      <w:r>
-        <w:rPr>
-          <w:rFonts w:ascii="Times New Roman" w:hAnsi="Times New Roman"/>
-          <w:i w:val="0"/>
+          <w:color w:val="000000"/>
+          <w:sz w:val="24"/>
+        </w:rPr>
+        <w:t xml:space="preserve">é a irradiância nesse plano, em W/m²;</w:t>
+      </w:r>
+      <w:r>
+        <w:rPr>
+          <w:rFonts w:ascii="Times New Roman" w:hAnsi="Times New Roman"/>
+          <w:i w:val="0"/>
+          <w:color w:val="000000"/>
+          <w:sz w:val="24"/>
         </w:rPr>
         <w:t xml:space="preserve"> </w:t>
       </w:r>
       <m:oMath>
+        <m:r>
+          <w:rPr>
+            <w:sz w:val="24"/>
+            <w:szCs w:val="24"/>
+          </w:rPr>
+          <m:t>t</m:t>
+        </m:r>
+      </m:oMath>
+      <w:r>
+        <w:rPr>
+          <w:rFonts w:ascii="Times New Roman" w:hAnsi="Times New Roman"/>
+          <w:i w:val="0"/>
+          <w:color w:val="000000"/>
+          <w:sz w:val="24"/>
+        </w:rPr>
+        <w:t xml:space="preserve"> </w:t>
+      </w:r>
+      <w:r>
+        <w:rPr>
+          <w:rFonts w:ascii="Times New Roman" w:hAnsi="Times New Roman"/>
+          <w:i w:val="0"/>
+          <w:color w:val="000000"/>
+          <w:sz w:val="24"/>
+        </w:rPr>
+        <w:t xml:space="preserve">é a variável temporal; e</w:t>
+      </w:r>
+      <w:r>
+        <w:rPr>
+          <w:rFonts w:ascii="Times New Roman" w:hAnsi="Times New Roman"/>
+          <w:i w:val="0"/>
+          <w:color w:val="000000"/>
+          <w:sz w:val="24"/>
+        </w:rPr>
+        <w:t xml:space="preserve"> </w:t>
+      </w:r>
+      <m:oMath>
+        <m:r>
+          <m:rPr>
+            <m:sty m:val="p"/>
+          </m:rPr>
+          <w:rPr>
+            <w:sz w:val="24"/>
+            <w:szCs w:val="24"/>
+          </w:rPr>
+          <m:t>d</m:t>
+        </m:r>
+        <m:r>
+          <w:rPr>
+            <w:sz w:val="24"/>
+            <w:szCs w:val="24"/>
+          </w:rPr>
+          <m:t>t</m:t>
+        </m:r>
+      </m:oMath>
+      <w:r>
+        <w:rPr>
+          <w:rFonts w:ascii="Times New Roman" w:hAnsi="Times New Roman"/>
+          <w:i w:val="0"/>
+          <w:color w:val="000000"/>
+          <w:sz w:val="24"/>
+        </w:rPr>
+        <w:t xml:space="preserve"> </w:t>
+      </w:r>
+      <w:r>
+        <w:rPr>
+          <w:rFonts w:ascii="Times New Roman" w:hAnsi="Times New Roman"/>
+          <w:i w:val="0"/>
+          <w:color w:val="000000"/>
+          <w:sz w:val="24"/>
+        </w:rPr>
+        <w:t xml:space="preserve">é o elemento de tempo da integração. Com o tempo em segundos,</w:t>
+      </w:r>
+      <w:r>
+        <w:rPr>
+          <w:rFonts w:ascii="Times New Roman" w:hAnsi="Times New Roman"/>
+          <w:i w:val="0"/>
+          <w:color w:val="000000"/>
+          <w:sz w:val="24"/>
+        </w:rPr>
+        <w:t xml:space="preserve"> </w:t>
+      </w:r>
+      <m:oMath>
+        <m:r>
+          <w:rPr>
+            <w:sz w:val="24"/>
+            <w:szCs w:val="24"/>
+          </w:rPr>
+          <m:t>H</m:t>
+        </m:r>
+      </m:oMath>
+      <w:r>
+        <w:rPr>
+          <w:rFonts w:ascii="Times New Roman" w:hAnsi="Times New Roman"/>
+          <w:i w:val="0"/>
+          <w:color w:val="000000"/>
+          <w:sz w:val="24"/>
+        </w:rPr>
+        <w:t xml:space="preserve"> </w:t>
+      </w:r>
+      <w:r>
+        <w:rPr>
+          <w:rFonts w:ascii="Times New Roman" w:hAnsi="Times New Roman"/>
+          <w:i w:val="0"/>
+          <w:color w:val="000000"/>
+          <w:sz w:val="24"/>
+        </w:rPr>
+        <w:t xml:space="preserve">é obtida em J/m²; com o tempo em horas, em Wh/m².</w:t>
+      </w:r>
+    </w:p>
+    <w:p>
+      <w:pPr>
+        <w:pStyle w:val="FirstParagraph"/>
+        <w:keepNext/>
+        <w:widowControl/>
+        <w:spacing w:line="360" w:lineRule="auto" w:after="120"/>
+        <w:ind w:firstLine="709"/>
+      </w:pPr>
+      <w:r>
+        <w:rPr>
+          <w:rFonts w:ascii="Times New Roman" w:hAnsi="Times New Roman"/>
+          <w:i w:val="0"/>
+          <w:color w:val="000000"/>
+          <w:sz w:val="24"/>
+        </w:rPr>
+        <w:t xml:space="preserve">A equivalência</w:t>
+      </w:r>
+      <w:r>
+        <w:rPr>
+          <w:rFonts w:ascii="Times New Roman" w:hAnsi="Times New Roman"/>
+          <w:i w:val="0"/>
+          <w:color w:val="000000"/>
+          <w:sz w:val="24"/>
+        </w:rPr>
+        <w:t xml:space="preserve"> </w:t>
+      </w:r>
+      <m:oMath>
+        <m:r>
+          <w:rPr>
+            <w:sz w:val="24"/>
+            <w:szCs w:val="24"/>
+          </w:rPr>
+          <m:t>1</m:t>
+        </m:r>
+        <m:r>
+          <w:rPr>
+            <w:sz w:val="24"/>
+            <w:szCs w:val="24"/>
+          </w:rPr>
+          <m:t> </m:t>
+        </m:r>
+        <m:r>
+          <m:rPr>
+            <m:sty m:val="p"/>
+          </m:rPr>
+          <w:rPr>
+            <w:sz w:val="24"/>
+            <w:szCs w:val="24"/>
+          </w:rPr>
+          <m:t>W</m:t>
+        </m:r>
+        <m:r>
+          <m:rPr>
+            <m:sty m:val="p"/>
+          </m:rPr>
+          <w:rPr>
+            <w:sz w:val="24"/>
+            <w:szCs w:val="24"/>
+          </w:rPr>
+          <m:t>h</m:t>
+        </m:r>
+        <m:r>
+          <m:rPr>
+            <m:sty m:val="p"/>
+          </m:rPr>
+          <w:rPr>
+            <w:sz w:val="24"/>
+            <w:szCs w:val="24"/>
+          </w:rPr>
+          <m:t>/</m:t>
+        </m:r>
+        <m:sSup>
+          <m:e>
+            <m:r>
+              <m:rPr>
+                <m:sty m:val="p"/>
+              </m:rPr>
+              <w:rPr>
+                <w:sz w:val="24"/>
+                <w:szCs w:val="24"/>
+              </w:rPr>
+              <m:t>m</m:t>
+            </m:r>
+          </m:e>
+          <m:sup>
+            <m:r>
+              <m:rPr>
+                <m:sty m:val="p"/>
+              </m:rPr>
+              <w:rPr>
+                <w:sz w:val="24"/>
+                <w:szCs w:val="24"/>
+              </w:rPr>
+              <m:t>2</m:t>
+            </m:r>
+          </m:sup>
+        </m:sSup>
+        <m:r>
+          <m:rPr>
+            <m:sty m:val="p"/>
+          </m:rPr>
+          <w:rPr>
+            <w:sz w:val="24"/>
+            <w:szCs w:val="24"/>
+          </w:rPr>
+          <m:t>=</m:t>
+        </m:r>
+        <m:r>
+          <w:rPr>
+            <w:sz w:val="24"/>
+            <w:szCs w:val="24"/>
+          </w:rPr>
+          <m:t>3600</m:t>
+        </m:r>
+        <m:r>
+          <w:rPr>
+            <w:sz w:val="24"/>
+            <w:szCs w:val="24"/>
+          </w:rPr>
+          <m:t> </m:t>
+        </m:r>
+        <m:r>
+          <m:rPr>
+            <m:sty m:val="p"/>
+          </m:rPr>
+          <w:rPr>
+            <w:sz w:val="24"/>
+            <w:szCs w:val="24"/>
+          </w:rPr>
+          <m:t>J</m:t>
+        </m:r>
+        <m:r>
+          <m:rPr>
+            <m:sty m:val="p"/>
+          </m:rPr>
+          <w:rPr>
+            <w:sz w:val="24"/>
+            <w:szCs w:val="24"/>
+          </w:rPr>
+          <m:t>/</m:t>
+        </m:r>
+        <m:sSup>
+          <m:e>
+            <m:r>
+              <m:rPr>
+                <m:sty m:val="p"/>
+              </m:rPr>
+              <w:rPr>
+                <w:sz w:val="24"/>
+                <w:szCs w:val="24"/>
+              </w:rPr>
+              <m:t>m</m:t>
+            </m:r>
+          </m:e>
+          <m:sup>
+            <m:r>
+              <m:rPr>
+                <m:sty m:val="p"/>
+              </m:rPr>
+              <w:rPr>
+                <w:sz w:val="24"/>
+                <w:szCs w:val="24"/>
+              </w:rPr>
+              <m:t>2</m:t>
+            </m:r>
+          </m:sup>
+        </m:sSup>
+      </m:oMath>
+      <w:r>
+        <w:rPr>
+          <w:rFonts w:ascii="Times New Roman" w:hAnsi="Times New Roman"/>
+          <w:i w:val="0"/>
+          <w:color w:val="000000"/>
+          <w:sz w:val="24"/>
+        </w:rPr>
+        <w:t xml:space="preserve"> </w:t>
+      </w:r>
+      <w:r>
+        <w:rPr>
+          <w:rFonts w:ascii="Times New Roman" w:hAnsi="Times New Roman"/>
+          <w:i w:val="0"/>
+          <w:color w:val="000000"/>
+          <w:sz w:val="24"/>
+        </w:rPr>
+        <w:t xml:space="preserve">decorre da definição de watt e da conversão entre hora e segundo. Para registros que representam médias de intervalos, a forma discreta é expressa pela equação (2):</w:t>
+      </w:r>
+    </w:p>
+    <w:p>
+      <w:pPr>
+        <w:keepNext/>
+        <w:keepLines/>
+        <w:widowControl/>
+        <w:tabs>
+          <w:tab w:pos="4535" w:val="center"/>
+          <w:tab w:pos="9071" w:val="right"/>
+        </w:tabs>
+        <w:spacing w:before="160" w:after="160" w:line="276" w:lineRule="auto"/>
+        <w:ind w:firstLine="0" w:left="0" w:right="0"/>
+        <w:jc w:val="left"/>
+      </w:pPr>
+      <w:r>
+        <w:rPr>
+          <w:rFonts w:ascii="Times New Roman" w:hAnsi="Times New Roman"/>
+          <w:sz w:val="24"/>
+        </w:rPr>
+        <w:tab/>
+      </w:r>
+      <m:oMath>
+        <m:r>
+          <w:rPr>
+            <w:sz w:val="24"/>
+            <w:szCs w:val="24"/>
+          </w:rPr>
+          <m:t>H</m:t>
+        </m:r>
+        <m:r>
+          <m:rPr>
+            <m:sty m:val="p"/>
+          </m:rPr>
+          <w:rPr>
+            <w:sz w:val="24"/>
+            <w:szCs w:val="24"/>
+          </w:rPr>
+          <m:t>=</m:t>
+        </m:r>
+        <m:nary>
+          <m:naryPr>
+            <m:chr m:val="∑"/>
+            <m:limLoc m:val="undOvr"/>
+            <m:subHide m:val="off"/>
+            <m:supHide m:val="on"/>
+          </m:naryPr>
+          <m:sub>
+            <m:r>
+              <w:rPr>
+                <w:sz w:val="24"/>
+                <w:szCs w:val="24"/>
+              </w:rPr>
+              <m:t>i</m:t>
+            </m:r>
+            <m:r>
+              <m:rPr>
+                <m:sty m:val="p"/>
+              </m:rPr>
+              <w:rPr>
+                <w:sz w:val="24"/>
+                <w:szCs w:val="24"/>
+              </w:rPr>
+              <m:t>∈</m:t>
+            </m:r>
+            <m:r>
+              <m:rPr>
+                <m:sty m:val="p"/>
+                <m:scr m:val="script"/>
+              </m:rPr>
+              <w:rPr>
+                <w:sz w:val="24"/>
+                <w:szCs w:val="24"/>
+              </w:rPr>
+              <m:t>V</m:t>
+            </m:r>
+          </m:sub>
+          <m:sup>
+            <m:r>
+              <w:rPr>
+                <w:sz w:val="24"/>
+                <w:szCs w:val="24"/>
+              </w:rPr>
+              <m:t/>
+            </m:r>
+          </m:sup>
+          <m:e>
+            <m:sSub>
+              <m:e>
+                <m:bar>
+                  <m:barPr>
+                    <m:pos m:val="top"/>
+                  </m:barPr>
+                  <m:e>
+                    <m:r>
+                      <w:rPr>
+                        <w:sz w:val="24"/>
+                        <w:szCs w:val="24"/>
+                      </w:rPr>
+                      <m:t>G</m:t>
+                    </m:r>
+                  </m:e>
+                </m:bar>
+              </m:e>
+              <m:sub>
+                <m:r>
+                  <w:rPr>
+                    <w:sz w:val="24"/>
+                    <w:szCs w:val="24"/>
+                  </w:rPr>
+                  <m:t>i</m:t>
+                </m:r>
+              </m:sub>
+            </m:sSub>
+          </m:e>
+        </m:nary>
+        <m:r>
+          <w:rPr>
+            <w:sz w:val="24"/>
+            <w:szCs w:val="24"/>
+          </w:rPr>
+          <m:t> </m:t>
+        </m:r>
+        <m:r>
+          <w:rPr>
+            <w:sz w:val="24"/>
+            <w:szCs w:val="24"/>
+          </w:rPr>
+          <m:t>Δ</m:t>
+        </m:r>
         <m:sSub>
           <m:e>
             <m:r>
               <w:rPr>
-                <w:sz w:val="28"/>
+                <w:sz w:val="24"/>
+                <w:szCs w:val="24"/>
               </w:rPr>
               <m:t>t</m:t>
             </m:r>
@@ -118,303 +1022,91 @@
           <m:sub>
             <m:r>
               <w:rPr>
-                <w:sz w:val="28"/>
-              </w:rPr>
-              <m:t>1</m:t>
+                <w:sz w:val="24"/>
+                <w:szCs w:val="24"/>
+              </w:rPr>
+              <m:t>i</m:t>
             </m:r>
           </m:sub>
         </m:sSub>
+        <m:r>
+          <m:rPr>
+            <m:sty m:val="p"/>
+          </m:rPr>
+          <w:rPr>
+            <w:sz w:val="24"/>
+            <w:szCs w:val="24"/>
+          </w:rPr>
+          <m:t>,</m:t>
+        </m:r>
       </m:oMath>
       <w:r>
         <w:rPr>
           <w:rFonts w:ascii="Times New Roman" w:hAnsi="Times New Roman"/>
-          <w:i w:val="0"/>
-        </w:rPr>
-        <w:t xml:space="preserve"> </w:t>
-      </w:r>
-      <w:r>
-        <w:rPr>
-          <w:rFonts w:ascii="Times New Roman" w:hAnsi="Times New Roman"/>
-          <w:i w:val="0"/>
-        </w:rPr>
-        <w:t xml:space="preserve">e</w:t>
-      </w:r>
-      <w:r>
-        <w:rPr>
-          <w:rFonts w:ascii="Times New Roman" w:hAnsi="Times New Roman"/>
-          <w:i w:val="0"/>
-        </w:rPr>
-        <w:t xml:space="preserve"> </w:t>
-      </w:r>
-      <m:oMath>
-        <m:sSub>
-          <m:e>
-            <m:r>
-              <w:rPr>
-                <w:sz w:val="28"/>
-              </w:rPr>
-              <m:t>t</m:t>
-            </m:r>
-          </m:e>
-          <m:sub>
-            <m:r>
-              <w:rPr>
-                <w:sz w:val="28"/>
-              </w:rPr>
-              <m:t>2</m:t>
-            </m:r>
-          </m:sub>
-        </m:sSub>
-      </m:oMath>
-      <w:r>
-        <w:rPr>
-          <w:rFonts w:ascii="Times New Roman" w:hAnsi="Times New Roman"/>
-          <w:i w:val="0"/>
-        </w:rPr>
-        <w:t xml:space="preserve"> </w:t>
-      </w:r>
-      <w:r>
-        <w:rPr>
-          <w:rFonts w:ascii="Times New Roman" w:hAnsi="Times New Roman"/>
-          <w:i w:val="0"/>
-        </w:rPr>
-        <w:t xml:space="preserve">é</w:t>
+          <w:sz w:val="24"/>
+        </w:rPr>
+        <w:tab/>
+        <w:t>(</w:t>
+      </w:r>
+      <w:bookmarkStart w:id="702" w:name="Equacao_soma"/>
+      <w:fldSimple w:instr=" SEQ Equacao \* ARABIC ">
+        <w:r>
+          <w:rPr>
+            <w:sz w:val="24"/>
+          </w:rPr>
+          <w:t>2</w:t>
+        </w:r>
+      </w:fldSimple>
+      <w:bookmarkEnd w:id="702"/>
+      <w:r>
+        <w:rPr>
+          <w:rFonts w:ascii="Times New Roman" w:hAnsi="Times New Roman"/>
+          <w:sz w:val="24"/>
+        </w:rPr>
+        <w:t>)</w:t>
       </w:r>
     </w:p>
     <w:p>
       <w:pPr>
         <w:pStyle w:val="BodyText"/>
         <w:widowControl/>
-        <w:spacing w:before="120" w:after="140"/>
-        <w:ind w:firstLine="0"/>
-        <w:jc w:val="center"/>
+        <w:spacing w:line="360" w:lineRule="auto" w:after="120"/>
+        <w:ind w:firstLine="709"/>
+        <w:jc w:val="both"/>
       </w:pPr>
-      <m:oMathPara>
-        <m:oMathParaPr>
-          <m:jc m:val="center"/>
-        </m:oMathParaPr>
-        <m:oMath>
-          <m:sSub>
-            <m:e>
-              <m:r>
-                <w:rPr>
-                  <w:sz w:val="32"/>
-                </w:rPr>
-                <m:t>H</m:t>
-              </m:r>
-            </m:e>
-            <m:sub>
-              <m:d>
-                <m:dPr>
-                  <m:begChr m:val="["/>
-                  <m:endChr m:val="]"/>
-                  <m:sepChr m:val=""/>
-                  <m:grow/>
-                </m:dPr>
-                <m:e>
-                  <m:sSub>
-                    <m:e>
-                      <m:r>
-                        <w:rPr>
-                          <w:sz w:val="32"/>
-                        </w:rPr>
-                        <m:t>t</m:t>
-                      </m:r>
-                    </m:e>
-                    <m:sub>
-                      <m:r>
-                        <w:rPr>
-                          <w:sz w:val="32"/>
-                        </w:rPr>
-                        <m:t>1</m:t>
-                      </m:r>
-                    </m:sub>
-                  </m:sSub>
-                  <m:r>
-                    <w:rPr>
-                      <w:sz w:val="32"/>
-                    </w:rPr>
-                    <m:rPr>
-                      <m:sty m:val="p"/>
-                    </m:rPr>
-                    <m:t>,</m:t>
-                  </m:r>
-                  <m:sSub>
-                    <m:e>
-                      <m:r>
-                        <w:rPr>
-                          <w:sz w:val="32"/>
-                        </w:rPr>
-                        <m:t>t</m:t>
-                      </m:r>
-                    </m:e>
-                    <m:sub>
-                      <m:r>
-                        <w:rPr>
-                          <w:sz w:val="32"/>
-                        </w:rPr>
-                        <m:t>2</m:t>
-                      </m:r>
-                    </m:sub>
-                  </m:sSub>
-                </m:e>
-              </m:d>
-            </m:sub>
-          </m:sSub>
-          <m:r>
-            <w:rPr>
-              <w:sz w:val="32"/>
-            </w:rPr>
-            <m:rPr>
-              <m:sty m:val="p"/>
-            </m:rPr>
-            <m:t>=</m:t>
-          </m:r>
-          <m:nary>
-            <m:naryPr>
-              <m:chr m:val="∫"/>
-              <m:limLoc m:val="subSup"/>
-              <m:subHide m:val="off"/>
-              <m:supHide m:val="off"/>
-            </m:naryPr>
-            <m:sub>
-              <m:sSub>
-                <m:e>
-                  <m:r>
-                    <w:rPr>
-                      <w:sz w:val="32"/>
-                    </w:rPr>
-                    <m:t>t</m:t>
-                  </m:r>
-                </m:e>
-                <m:sub>
-                  <m:r>
-                    <w:rPr>
-                      <w:sz w:val="32"/>
-                    </w:rPr>
-                    <m:t>1</m:t>
-                  </m:r>
-                </m:sub>
-              </m:sSub>
-            </m:sub>
-            <m:sup>
-              <m:sSub>
-                <m:e>
-                  <m:r>
-                    <w:rPr>
-                      <w:sz w:val="32"/>
-                    </w:rPr>
-                    <m:t>t</m:t>
-                  </m:r>
-                </m:e>
-                <m:sub>
-                  <m:r>
-                    <w:rPr>
-                      <w:sz w:val="32"/>
-                    </w:rPr>
-                    <m:t>2</m:t>
-                  </m:r>
-                </m:sub>
-              </m:sSub>
-            </m:sup>
-            <m:e>
-              <m:r>
-                <w:rPr>
-                  <w:sz w:val="32"/>
-                </w:rPr>
-                <m:t>G</m:t>
-              </m:r>
-            </m:e>
-          </m:nary>
-          <m:d>
-            <m:dPr>
-              <m:begChr m:val="("/>
-              <m:endChr m:val=")"/>
-              <m:sepChr m:val=""/>
-              <m:grow/>
-            </m:dPr>
-            <m:e>
-              <m:r>
-                <w:rPr>
-                  <w:sz w:val="32"/>
-                </w:rPr>
-                <m:t>t</m:t>
-              </m:r>
-            </m:e>
-          </m:d>
-          <m:r>
-            <w:rPr>
-              <w:sz w:val="32"/>
-            </w:rPr>
-            <m:t> </m:t>
-          </m:r>
-          <m:r>
-            <w:rPr>
-              <w:sz w:val="32"/>
-            </w:rPr>
-            <m:rPr>
-              <m:sty m:val="p"/>
-            </m:rPr>
-            <m:t>d</m:t>
-          </m:r>
-          <m:r>
-            <w:rPr>
-              <w:sz w:val="32"/>
-            </w:rPr>
-            <m:t>t</m:t>
-          </m:r>
-          <m:r>
-            <w:rPr>
-              <w:sz w:val="32"/>
-            </w:rPr>
-            <m:rPr>
-              <m:sty m:val="p"/>
-            </m:rPr>
-            <m:t>.</m:t>
-          </m:r>
-          <m:r>
-            <w:rPr>
-              <w:sz w:val="32"/>
-            </w:rPr>
-            <m:rPr>
-              <m:sty m:val="p"/>
-            </m:rPr>
-            <m:t>   (E1.03)</m:t>
-          </m:r>
-        </m:oMath>
-      </m:oMathPara>
-    </w:p>
-    <w:p>
-      <w:pPr>
-        <w:pStyle w:val="FirstParagraph"/>
-        <w:widowControl/>
-      </w:pPr>
-      <w:r>
-        <w:rPr>
-          <w:rFonts w:ascii="Times New Roman" w:hAnsi="Times New Roman"/>
-          <w:i w:val="0"/>
-        </w:rPr>
-        <w:t xml:space="preserve">Com</w:t>
-      </w:r>
-      <w:r>
-        <w:rPr>
-          <w:rFonts w:ascii="Times New Roman" w:hAnsi="Times New Roman"/>
-          <w:i w:val="0"/>
+      <w:r>
+        <w:rPr>
+          <w:rFonts w:ascii="Times New Roman" w:hAnsi="Times New Roman"/>
+          <w:i w:val="0"/>
+          <w:color w:val="000000"/>
+          <w:sz w:val="24"/>
+        </w:rPr>
+        <w:t xml:space="preserve">em que</w:t>
+      </w:r>
+      <w:r>
+        <w:rPr>
+          <w:rFonts w:ascii="Times New Roman" w:hAnsi="Times New Roman"/>
+          <w:i w:val="0"/>
+          <w:color w:val="000000"/>
+          <w:sz w:val="24"/>
         </w:rPr>
         <w:t xml:space="preserve"> </w:t>
       </w:r>
       <m:oMath>
         <m:r>
           <w:rPr>
-            <w:sz w:val="28"/>
-          </w:rPr>
-          <m:t>G</m:t>
+            <w:sz w:val="24"/>
+            <w:szCs w:val="24"/>
+          </w:rPr>
+          <m:t>H</m:t>
         </m:r>
       </m:oMath>
       <w:r>
         <w:rPr>
           <w:rFonts w:ascii="Times New Roman" w:hAnsi="Times New Roman"/>
           <w:i w:val="0"/>
+          <w:color w:val="000000"/>
+          <w:sz w:val="24"/>
         </w:rPr>
         <w:t xml:space="preserve"> </w:t>
       </w:r>
@@ -422,353 +1114,17 @@
         <w:rPr>
           <w:rFonts w:ascii="Times New Roman" w:hAnsi="Times New Roman"/>
           <w:i w:val="0"/>
-        </w:rPr>
-        <w:t xml:space="preserve">em W/m² e o tempo em segundos,</w:t>
-      </w:r>
-      <w:r>
-        <w:rPr>
-          <w:rFonts w:ascii="Times New Roman" w:hAnsi="Times New Roman"/>
-          <w:i w:val="0"/>
-        </w:rPr>
-        <w:t xml:space="preserve"> </w:t>
-      </w:r>
-      <m:oMath>
-        <m:r>
-          <w:rPr>
-            <w:sz w:val="28"/>
-          </w:rPr>
-          <m:t>H</m:t>
-        </m:r>
-      </m:oMath>
-      <w:r>
-        <w:rPr>
-          <w:rFonts w:ascii="Times New Roman" w:hAnsi="Times New Roman"/>
-          <w:i w:val="0"/>
-        </w:rPr>
-        <w:t xml:space="preserve"> </w:t>
-      </w:r>
-      <w:r>
-        <w:rPr>
-          <w:rFonts w:ascii="Times New Roman" w:hAnsi="Times New Roman"/>
-          <w:i w:val="0"/>
-        </w:rPr>
-        <w:t xml:space="preserve">é obtida em J/m². Quando o tempo é expresso em horas, a integração fornece Wh/m². A equivalência</w:t>
-      </w:r>
-      <w:r>
-        <w:rPr>
-          <w:rFonts w:ascii="Times New Roman" w:hAnsi="Times New Roman"/>
-          <w:i w:val="0"/>
-        </w:rPr>
-        <w:t xml:space="preserve"> </w:t>
-      </w:r>
-      <m:oMath>
-        <m:r>
-          <w:rPr>
-            <w:sz w:val="28"/>
-          </w:rPr>
-          <m:t>1</m:t>
-        </m:r>
-        <m:r>
-          <w:rPr>
-            <w:sz w:val="28"/>
-          </w:rPr>
-          <m:t> </m:t>
-        </m:r>
-        <m:r>
-          <w:rPr>
-            <w:sz w:val="28"/>
-          </w:rPr>
-          <m:rPr>
-            <m:sty m:val="p"/>
-          </m:rPr>
-          <m:t>W</m:t>
-        </m:r>
-        <m:r>
-          <w:rPr>
-            <w:sz w:val="28"/>
-          </w:rPr>
-          <m:rPr>
-            <m:sty m:val="p"/>
-          </m:rPr>
-          <m:t>h</m:t>
-        </m:r>
-        <m:r>
-          <w:rPr>
-            <w:sz w:val="28"/>
-          </w:rPr>
-          <m:rPr>
-            <m:sty m:val="p"/>
-          </m:rPr>
-          <m:t>/</m:t>
-        </m:r>
-        <m:sSup>
-          <m:e>
-            <m:r>
-              <w:rPr>
-                <w:sz w:val="28"/>
-              </w:rPr>
-              <m:rPr>
-                <m:sty m:val="p"/>
-              </m:rPr>
-              <m:t>m</m:t>
-            </m:r>
-          </m:e>
-          <m:sup>
-            <m:r>
-              <w:rPr>
-                <w:sz w:val="28"/>
-              </w:rPr>
-              <m:rPr>
-                <m:sty m:val="p"/>
-              </m:rPr>
-              <m:t>2</m:t>
-            </m:r>
-          </m:sup>
-        </m:sSup>
-        <m:r>
-          <w:rPr>
-            <w:sz w:val="28"/>
-          </w:rPr>
-          <m:rPr>
-            <m:sty m:val="p"/>
-          </m:rPr>
-          <m:t>=</m:t>
-        </m:r>
-        <m:r>
-          <w:rPr>
-            <w:sz w:val="28"/>
-          </w:rPr>
-          <m:t>3600</m:t>
-        </m:r>
-        <m:r>
-          <w:rPr>
-            <w:sz w:val="28"/>
-          </w:rPr>
-          <m:t> </m:t>
-        </m:r>
-        <m:r>
-          <w:rPr>
-            <w:sz w:val="28"/>
-          </w:rPr>
-          <m:rPr>
-            <m:sty m:val="p"/>
-          </m:rPr>
-          <m:t>J</m:t>
-        </m:r>
-        <m:r>
-          <w:rPr>
-            <w:sz w:val="28"/>
-          </w:rPr>
-          <m:rPr>
-            <m:sty m:val="p"/>
-          </m:rPr>
-          <m:t>/</m:t>
-        </m:r>
-        <m:sSup>
-          <m:e>
-            <m:r>
-              <w:rPr>
-                <w:sz w:val="28"/>
-              </w:rPr>
-              <m:rPr>
-                <m:sty m:val="p"/>
-              </m:rPr>
-              <m:t>m</m:t>
-            </m:r>
-          </m:e>
-          <m:sup>
-            <m:r>
-              <w:rPr>
-                <w:sz w:val="28"/>
-              </w:rPr>
-              <m:rPr>
-                <m:sty m:val="p"/>
-              </m:rPr>
-              <m:t>2</m:t>
-            </m:r>
-          </m:sup>
-        </m:sSup>
-      </m:oMath>
-      <w:r>
-        <w:rPr>
-          <w:rFonts w:ascii="Times New Roman" w:hAnsi="Times New Roman"/>
-          <w:i w:val="0"/>
-        </w:rPr>
-        <w:t xml:space="preserve"> </w:t>
-      </w:r>
-      <w:r>
-        <w:rPr>
-          <w:rFonts w:ascii="Times New Roman" w:hAnsi="Times New Roman"/>
-          <w:i w:val="0"/>
-        </w:rPr>
-        <w:t xml:space="preserve">decorre da definição de watt e da conversão entre hora e segundo. Para registros que representam médias de intervalos, a forma discreta é</w:t>
-      </w:r>
-    </w:p>
-    <w:p>
-      <w:pPr>
-        <w:pStyle w:val="BodyText"/>
-        <w:widowControl/>
-        <w:spacing w:before="120" w:after="140"/>
-        <w:ind w:firstLine="0"/>
-        <w:jc w:val="center"/>
-      </w:pPr>
-      <m:oMathPara>
-        <m:oMathParaPr>
-          <m:jc m:val="center"/>
-        </m:oMathParaPr>
-        <m:oMath>
-          <m:r>
-            <w:rPr>
-              <w:sz w:val="32"/>
-            </w:rPr>
-            <m:t>H</m:t>
-          </m:r>
-          <m:r>
-            <w:rPr>
-              <w:sz w:val="32"/>
-            </w:rPr>
-            <m:rPr>
-              <m:sty m:val="p"/>
-            </m:rPr>
-            <m:t>=</m:t>
-          </m:r>
-          <m:nary>
-            <m:naryPr>
-              <m:chr m:val="∑"/>
-              <m:limLoc m:val="undOvr"/>
-              <m:subHide m:val="off"/>
-              <m:supHide m:val="on"/>
-            </m:naryPr>
-            <m:sub>
-              <m:r>
-                <w:rPr>
-                  <w:sz w:val="32"/>
-                </w:rPr>
-                <m:t>i</m:t>
-              </m:r>
-              <m:r>
-                <w:rPr>
-                  <w:sz w:val="32"/>
-                </w:rPr>
-                <m:rPr>
-                  <m:sty m:val="p"/>
-                </m:rPr>
-                <m:t>∈</m:t>
-              </m:r>
-              <m:r>
-                <w:rPr>
-                  <w:sz w:val="32"/>
-                </w:rPr>
-                <m:rPr>
-                  <m:sty m:val="p"/>
-                  <m:scr m:val="script"/>
-                </m:rPr>
-                <m:t>V</m:t>
-              </m:r>
-            </m:sub>
-            <m:sup>
-              <m:r>
-                <w:rPr>
-                  <w:sz w:val="32"/>
-                </w:rPr>
-                <m:t/>
-              </m:r>
-            </m:sup>
-            <m:e>
-              <m:sSub>
-                <m:e>
-                  <m:bar>
-                    <m:barPr>
-                      <m:pos m:val="top"/>
-                    </m:barPr>
-                    <m:e>
-                      <m:r>
-                        <w:rPr>
-                          <w:sz w:val="32"/>
-                        </w:rPr>
-                        <m:t>G</m:t>
-                      </m:r>
-                    </m:e>
-                  </m:bar>
-                </m:e>
-                <m:sub>
-                  <m:r>
-                    <w:rPr>
-                      <w:sz w:val="32"/>
-                    </w:rPr>
-                    <m:t>i</m:t>
-                  </m:r>
-                </m:sub>
-              </m:sSub>
-            </m:e>
-          </m:nary>
-          <m:r>
-            <w:rPr>
-              <w:sz w:val="32"/>
-            </w:rPr>
-            <m:t> </m:t>
-          </m:r>
-          <m:r>
-            <w:rPr>
-              <w:sz w:val="32"/>
-            </w:rPr>
-            <m:t>Δ</m:t>
-          </m:r>
-          <m:sSub>
-            <m:e>
-              <m:r>
-                <w:rPr>
-                  <w:sz w:val="32"/>
-                </w:rPr>
-                <m:t>t</m:t>
-              </m:r>
-            </m:e>
-            <m:sub>
-              <m:r>
-                <w:rPr>
-                  <w:sz w:val="32"/>
-                </w:rPr>
-                <m:t>i</m:t>
-              </m:r>
-            </m:sub>
-          </m:sSub>
-          <m:r>
-            <w:rPr>
-              <w:sz w:val="32"/>
-            </w:rPr>
-            <m:rPr>
-              <m:sty m:val="p"/>
-            </m:rPr>
-            <m:t>,</m:t>
-          </m:r>
-          <m:r>
-            <w:rPr>
-              <w:sz w:val="32"/>
-            </w:rPr>
-            <m:rPr>
-              <m:sty m:val="p"/>
-            </m:rPr>
-            <m:t>   (E1.04)</m:t>
-          </m:r>
-        </m:oMath>
-      </m:oMathPara>
-    </w:p>
-    <w:p>
-      <w:pPr>
-        <w:pStyle w:val="FirstParagraph"/>
-        <w:widowControl/>
-      </w:pPr>
-      <w:r>
-        <w:rPr>
-          <w:rFonts w:ascii="Times New Roman" w:hAnsi="Times New Roman"/>
-          <w:i w:val="0"/>
-        </w:rPr>
-        <w:t xml:space="preserve">em que</w:t>
-      </w:r>
-      <w:r>
-        <w:rPr>
-          <w:rFonts w:ascii="Times New Roman" w:hAnsi="Times New Roman"/>
-          <w:i w:val="0"/>
+          <w:color w:val="000000"/>
+          <w:sz w:val="24"/>
+        </w:rPr>
+        <w:t xml:space="preserve">é a irradiação dos intervalos incluídos;</w:t>
+      </w:r>
+      <w:r>
+        <w:rPr>
+          <w:rFonts w:ascii="Times New Roman" w:hAnsi="Times New Roman"/>
+          <w:i w:val="0"/>
+          <w:color w:val="000000"/>
+          <w:sz w:val="24"/>
         </w:rPr>
         <w:t xml:space="preserve"> </w:t>
       </w:r>
@@ -782,7 +1138,8 @@
               <m:e>
                 <m:r>
                   <w:rPr>
-                    <w:sz w:val="28"/>
+                    <w:sz w:val="24"/>
+                    <w:szCs w:val="24"/>
                   </w:rPr>
                   <m:t>G</m:t>
                 </m:r>
@@ -792,7 +1149,8 @@
           <m:sub>
             <m:r>
               <w:rPr>
-                <w:sz w:val="28"/>
+                <w:sz w:val="24"/>
+                <w:szCs w:val="24"/>
               </w:rPr>
               <m:t>i</m:t>
             </m:r>
@@ -803,6 +1161,8 @@
         <w:rPr>
           <w:rFonts w:ascii="Times New Roman" w:hAnsi="Times New Roman"/>
           <w:i w:val="0"/>
+          <w:color w:val="000000"/>
+          <w:sz w:val="24"/>
         </w:rPr>
         <w:t xml:space="preserve"> </w:t>
       </w:r>
@@ -810,20 +1170,52 @@
         <w:rPr>
           <w:rFonts w:ascii="Times New Roman" w:hAnsi="Times New Roman"/>
           <w:i w:val="0"/>
-        </w:rPr>
-        <w:t xml:space="preserve">é a irradiância média do intervalo,</w:t>
-      </w:r>
-      <w:r>
-        <w:rPr>
-          <w:rFonts w:ascii="Times New Roman" w:hAnsi="Times New Roman"/>
-          <w:i w:val="0"/>
+          <w:color w:val="000000"/>
+          <w:sz w:val="24"/>
+        </w:rPr>
+        <w:t xml:space="preserve">é a irradiância média do intervalo</w:t>
+      </w:r>
+      <w:r>
+        <w:rPr>
+          <w:rFonts w:ascii="Times New Roman" w:hAnsi="Times New Roman"/>
+          <w:i w:val="0"/>
+          <w:color w:val="000000"/>
+          <w:sz w:val="24"/>
         </w:rPr>
         <w:t xml:space="preserve"> </w:t>
       </w:r>
       <m:oMath>
         <m:r>
           <w:rPr>
-            <w:sz w:val="28"/>
+            <w:sz w:val="24"/>
+            <w:szCs w:val="24"/>
+          </w:rPr>
+          <m:t>i</m:t>
+        </m:r>
+      </m:oMath>
+      <w:r>
+        <w:rPr>
+          <w:rFonts w:ascii="Times New Roman" w:hAnsi="Times New Roman"/>
+          <w:i w:val="0"/>
+          <w:color w:val="000000"/>
+          <w:sz w:val="24"/>
+        </w:rPr>
+        <w:t xml:space="preserve">, em W/m²;</w:t>
+      </w:r>
+      <w:r>
+        <w:rPr>
+          <w:rFonts w:ascii="Times New Roman" w:hAnsi="Times New Roman"/>
+          <w:i w:val="0"/>
+          <w:color w:val="000000"/>
+          <w:sz w:val="24"/>
+        </w:rPr>
+        <w:t xml:space="preserve"> </w:t>
+      </w:r>
+      <m:oMath>
+        <m:r>
+          <w:rPr>
+            <w:sz w:val="24"/>
+            <w:szCs w:val="24"/>
           </w:rPr>
           <m:t>Δ</m:t>
         </m:r>
@@ -831,7 +1223,8 @@
           <m:e>
             <m:r>
               <w:rPr>
-                <w:sz w:val="28"/>
+                <w:sz w:val="24"/>
+                <w:szCs w:val="24"/>
               </w:rPr>
               <m:t>t</m:t>
             </m:r>
@@ -839,7 +1232,8 @@
           <m:sub>
             <m:r>
               <w:rPr>
-                <w:sz w:val="28"/>
+                <w:sz w:val="24"/>
+                <w:szCs w:val="24"/>
               </w:rPr>
               <m:t>i</m:t>
             </m:r>
@@ -850,6 +1244,8 @@
         <w:rPr>
           <w:rFonts w:ascii="Times New Roman" w:hAnsi="Times New Roman"/>
           <w:i w:val="0"/>
+          <w:color w:val="000000"/>
+          <w:sz w:val="24"/>
         </w:rPr>
         <w:t xml:space="preserve"> </w:t>
       </w:r>
@@ -857,25 +1253,30 @@
         <w:rPr>
           <w:rFonts w:ascii="Times New Roman" w:hAnsi="Times New Roman"/>
           <w:i w:val="0"/>
-        </w:rPr>
-        <w:t xml:space="preserve">é sua duração e</w:t>
-      </w:r>
-      <w:r>
-        <w:rPr>
-          <w:rFonts w:ascii="Times New Roman" w:hAnsi="Times New Roman"/>
-          <w:i w:val="0"/>
+          <w:color w:val="000000"/>
+          <w:sz w:val="24"/>
+        </w:rPr>
+        <w:t xml:space="preserve">é sua duração; e</w:t>
+      </w:r>
+      <w:r>
+        <w:rPr>
+          <w:rFonts w:ascii="Times New Roman" w:hAnsi="Times New Roman"/>
+          <w:i w:val="0"/>
+          <w:color w:val="000000"/>
+          <w:sz w:val="24"/>
         </w:rPr>
         <w:t xml:space="preserve"> </w:t>
       </w:r>
       <m:oMath>
         <m:r>
-          <w:rPr>
-            <w:sz w:val="28"/>
-          </w:rPr>
           <m:rPr>
             <m:sty m:val="p"/>
             <m:scr m:val="script"/>
           </m:rPr>
+          <w:rPr>
+            <w:sz w:val="24"/>
+            <w:szCs w:val="24"/>
+          </w:rPr>
           <m:t>V</m:t>
         </m:r>
       </m:oMath>
@@ -883,6 +1284,8 @@
         <w:rPr>
           <w:rFonts w:ascii="Times New Roman" w:hAnsi="Times New Roman"/>
           <w:i w:val="0"/>
+          <w:color w:val="000000"/>
+          <w:sz w:val="24"/>
         </w:rPr>
         <w:t xml:space="preserve"> </w:t>
       </w:r>
@@ -890,8 +1293,63 @@
         <w:rPr>
           <w:rFonts w:ascii="Times New Roman" w:hAnsi="Times New Roman"/>
           <w:i w:val="0"/>
-        </w:rPr>
-        <w:t xml:space="preserve">é o conjunto de intervalos válidos. A forma discreta é aqui derivada da definição integral sob a hipótese de médias de intervalo. Essa soma representa a energia dos intervalos efetivamente incluídos; não reconstitui a energia dos intervalos ausentes. Se o registro for uma amostra instantânea, a integração por soma ou por outra quadratura constitui uma aproximação adicional. Portanto, a resolução nominal de um arquivo não informa, por si só, se seus valores são instantâneos, médios ou acumulados. A interpretação deve ser obtida nos metadados de aquisição e processamento (DUFFIE; BECKMAN; BLAIR, 2020, p. 10; SENGUPTA et al., 2024, cap. 6, p. 24–25).</w:t>
+          <w:color w:val="000000"/>
+          <w:sz w:val="24"/>
+        </w:rPr>
+        <w:t xml:space="preserve">é o conjunto de intervalos válidos sobre os quais se realiza a soma. O índice</w:t>
+      </w:r>
+      <w:r>
+        <w:rPr>
+          <w:rFonts w:ascii="Times New Roman" w:hAnsi="Times New Roman"/>
+          <w:i w:val="0"/>
+          <w:color w:val="000000"/>
+          <w:sz w:val="24"/>
+        </w:rPr>
+        <w:t xml:space="preserve"> </w:t>
+      </w:r>
+      <m:oMath>
+        <m:r>
+          <w:rPr>
+            <w:sz w:val="24"/>
+            <w:szCs w:val="24"/>
+          </w:rPr>
+          <m:t>i</m:t>
+        </m:r>
+      </m:oMath>
+      <w:r>
+        <w:rPr>
+          <w:rFonts w:ascii="Times New Roman" w:hAnsi="Times New Roman"/>
+          <w:i w:val="0"/>
+          <w:color w:val="000000"/>
+          <w:sz w:val="24"/>
+        </w:rPr>
+        <w:t xml:space="preserve"> </w:t>
+      </w:r>
+      <w:r>
+        <w:rPr>
+          <w:rFonts w:ascii="Times New Roman" w:hAnsi="Times New Roman"/>
+          <w:i w:val="0"/>
+          <w:color w:val="000000"/>
+          <w:sz w:val="24"/>
+        </w:rPr>
+        <w:t xml:space="preserve">identifica cada intervalo incluído. Se a duração é dada em horas, o resultado é Wh/m²; se é dada em segundos, é J/m². A soma não inclui a energia de intervalos ausentes.</w:t>
+      </w:r>
+    </w:p>
+    <w:p>
+      <w:pPr>
+        <w:pStyle w:val="FirstParagraph"/>
+        <w:widowControl/>
+        <w:spacing w:line="360" w:lineRule="auto" w:after="120"/>
+        <w:ind w:firstLine="709"/>
+      </w:pPr>
+      <w:r>
+        <w:rPr>
+          <w:rFonts w:ascii="Times New Roman" w:hAnsi="Times New Roman"/>
+          <w:i w:val="0"/>
+          <w:color w:val="000000"/>
+          <w:sz w:val="24"/>
+        </w:rPr>
+        <w:t xml:space="preserve">A forma discreta é aqui derivada da definição integral sob a hipótese de médias de intervalo. Essa soma representa a energia dos intervalos efetivamente incluídos; não reconstitui a energia dos intervalos ausentes. Se o registro for uma amostra instantânea, a integração por soma ou por outra quadratura constitui uma aproximação adicional. Portanto, a resolução nominal de um arquivo não informa, por si só, se seus valores são instantâneos, médios ou acumulados. A interpretação deve ser obtida nos metadados de aquisição e processamento (DUFFIE; BECKMAN; BLAIR, 2020, p. 10; SENGUPTA et al., 2024, cap. 6, p. 24–25).</w:t>
       </w:r>
     </w:p>
     <w:bookmarkEnd w:id="20"/>
@@ -899,11 +1357,18 @@
     <w:p>
       <w:pPr>
         <w:pStyle w:val="Heading2"/>
+        <w:keepNext/>
         <w:widowControl/>
+        <w:spacing w:line="360" w:lineRule="auto" w:after="120"/>
+        <w:ind w:firstLine="0"/>
       </w:pPr>
       <w:r>
         <w:rPr>
+          <w:rFonts w:ascii="Times New Roman" w:hAnsi="Times New Roman"/>
           <w:b/>
+          <w:i w:val="0"/>
+          <w:color w:val="000000"/>
+          <w:sz w:val="24"/>
         </w:rPr>
         <w:t>1.2.2 COMPONENTES DIRETA, DIFUSA E GLOBAL HORIZONTAL</w:t>
       </w:r>
@@ -912,249 +1377,450 @@
       <w:pPr>
         <w:pStyle w:val="FirstParagraph"/>
         <w:widowControl/>
+        <w:spacing w:line="360" w:lineRule="auto" w:after="120"/>
+        <w:ind w:firstLine="709"/>
       </w:pPr>
       <w:r>
         <w:rPr>
           <w:rFonts w:ascii="Times New Roman" w:hAnsi="Times New Roman"/>
           <w:i w:val="0"/>
+          <w:color w:val="000000"/>
+          <w:sz w:val="24"/>
         </w:rPr>
         <w:t xml:space="preserve">A interação da radiação solar com a atmosfera produz um campo radiativo com contribuições direcionais distintas. A irradiância direta normal, DNI, é referida a uma superfície perpendicular à direção solar e à radiação proveniente de uma pequena região angular centrada no Sol. A irradiância difusa horizontal, DHI, é a contribuição do céu recebida por uma superfície horizontal, excluída a região angular atribuída à componente direta. A irradiância global horizontal, GHI, representa a irradiância solar descendente total de ondas curtas recebida no plano horizontal. As três grandezas são expressas em W/m²; suas diferenças decorrem da direção de recepção e do campo angular integrado, e não da unidade (SENGUPTA et al., 2024, cap. 2, p. 9–10).</w:t>
+      </w:r>
+    </w:p>
+    <w:p>
+      <w:pPr>
+        <w:pStyle w:val="BodyText"/>
+        <w:keepNext/>
+        <w:widowControl/>
+        <w:spacing w:line="360" w:lineRule="auto" w:after="120"/>
+        <w:ind w:firstLine="709"/>
+      </w:pPr>
+      <w:r>
+        <w:rPr>
+          <w:rFonts w:ascii="Times New Roman" w:hAnsi="Times New Roman"/>
+          <w:i w:val="0"/>
+          <w:color w:val="000000"/>
+          <w:sz w:val="24"/>
+        </w:rPr>
+        <w:t xml:space="preserve">Para o Sol acima do horizonte e para definições radiométricas compatíveis, o balanço geométrico ideal é expresso pela equação (3):</w:t>
+      </w:r>
+    </w:p>
+    <w:p>
+      <w:pPr>
+        <w:keepNext/>
+        <w:keepLines/>
+        <w:widowControl/>
+        <w:tabs>
+          <w:tab w:pos="4535" w:val="center"/>
+          <w:tab w:pos="9071" w:val="right"/>
+        </w:tabs>
+        <w:spacing w:before="160" w:after="160" w:line="276" w:lineRule="auto"/>
+        <w:ind w:firstLine="0" w:left="0" w:right="0"/>
+        <w:jc w:val="left"/>
+      </w:pPr>
+      <w:r>
+        <w:rPr>
+          <w:rFonts w:ascii="Times New Roman" w:hAnsi="Times New Roman"/>
+          <w:sz w:val="24"/>
+        </w:rPr>
+        <w:tab/>
+      </w:r>
+      <m:oMath>
+        <m:r>
+          <m:rPr>
+            <m:sty m:val="p"/>
+          </m:rPr>
+          <w:rPr>
+            <w:sz w:val="24"/>
+            <w:szCs w:val="24"/>
+          </w:rPr>
+          <m:t>G</m:t>
+        </m:r>
+        <m:r>
+          <m:rPr>
+            <m:sty m:val="p"/>
+          </m:rPr>
+          <w:rPr>
+            <w:sz w:val="24"/>
+            <w:szCs w:val="24"/>
+          </w:rPr>
+          <m:t>H</m:t>
+        </m:r>
+        <m:r>
+          <m:rPr>
+            <m:sty m:val="p"/>
+          </m:rPr>
+          <w:rPr>
+            <w:sz w:val="24"/>
+            <w:szCs w:val="24"/>
+          </w:rPr>
+          <m:t>I</m:t>
+        </m:r>
+        <m:r>
+          <m:rPr>
+            <m:sty m:val="p"/>
+          </m:rPr>
+          <w:rPr>
+            <w:sz w:val="24"/>
+            <w:szCs w:val="24"/>
+          </w:rPr>
+          <m:t>=</m:t>
+        </m:r>
+        <m:r>
+          <m:rPr>
+            <m:sty m:val="p"/>
+          </m:rPr>
+          <w:rPr>
+            <w:sz w:val="24"/>
+            <w:szCs w:val="24"/>
+          </w:rPr>
+          <m:t>D</m:t>
+        </m:r>
+        <m:r>
+          <m:rPr>
+            <m:sty m:val="p"/>
+          </m:rPr>
+          <w:rPr>
+            <w:sz w:val="24"/>
+            <w:szCs w:val="24"/>
+          </w:rPr>
+          <m:t>N</m:t>
+        </m:r>
+        <m:r>
+          <m:rPr>
+            <m:sty m:val="p"/>
+          </m:rPr>
+          <w:rPr>
+            <w:sz w:val="24"/>
+            <w:szCs w:val="24"/>
+          </w:rPr>
+          <m:t>I</m:t>
+        </m:r>
+        <m:r>
+          <m:rPr>
+            <m:sty m:val="p"/>
+          </m:rPr>
+          <w:rPr>
+            <w:sz w:val="24"/>
+            <w:szCs w:val="24"/>
+          </w:rPr>
+          <m:t>cos</m:t>
+        </m:r>
+        <m:sSub>
+          <m:e>
+            <m:r>
+              <w:rPr>
+                <w:sz w:val="24"/>
+                <w:szCs w:val="24"/>
+              </w:rPr>
+              <m:t>θ</m:t>
+            </m:r>
+          </m:e>
+          <m:sub>
+            <m:r>
+              <w:rPr>
+                <w:sz w:val="24"/>
+                <w:szCs w:val="24"/>
+              </w:rPr>
+              <m:t>z</m:t>
+            </m:r>
+          </m:sub>
+        </m:sSub>
+        <m:r>
+          <m:rPr>
+            <m:sty m:val="p"/>
+          </m:rPr>
+          <w:rPr>
+            <w:sz w:val="24"/>
+            <w:szCs w:val="24"/>
+          </w:rPr>
+          <m:t>+</m:t>
+        </m:r>
+        <m:r>
+          <m:rPr>
+            <m:sty m:val="p"/>
+          </m:rPr>
+          <w:rPr>
+            <w:sz w:val="24"/>
+            <w:szCs w:val="24"/>
+          </w:rPr>
+          <m:t>D</m:t>
+        </m:r>
+        <m:r>
+          <m:rPr>
+            <m:sty m:val="p"/>
+          </m:rPr>
+          <w:rPr>
+            <w:sz w:val="24"/>
+            <w:szCs w:val="24"/>
+          </w:rPr>
+          <m:t>H</m:t>
+        </m:r>
+        <m:r>
+          <m:rPr>
+            <m:sty m:val="p"/>
+          </m:rPr>
+          <w:rPr>
+            <w:sz w:val="24"/>
+            <w:szCs w:val="24"/>
+          </w:rPr>
+          <m:t>I</m:t>
+        </m:r>
+        <m:r>
+          <m:rPr>
+            <m:sty m:val="p"/>
+          </m:rPr>
+          <w:rPr>
+            <w:sz w:val="24"/>
+            <w:szCs w:val="24"/>
+          </w:rPr>
+          <m:t>.</m:t>
+        </m:r>
+      </m:oMath>
+      <w:r>
+        <w:rPr>
+          <w:rFonts w:ascii="Times New Roman" w:hAnsi="Times New Roman"/>
+          <w:sz w:val="24"/>
+        </w:rPr>
+        <w:tab/>
+        <w:t>(</w:t>
+      </w:r>
+      <w:bookmarkStart w:id="703" w:name="Equacao_fechamento"/>
+      <w:fldSimple w:instr=" SEQ Equacao \* ARABIC ">
+        <w:r>
+          <w:rPr>
+            <w:sz w:val="24"/>
+          </w:rPr>
+          <w:t>3</w:t>
+        </w:r>
+      </w:fldSimple>
+      <w:bookmarkEnd w:id="703"/>
+      <w:r>
+        <w:rPr>
+          <w:rFonts w:ascii="Times New Roman" w:hAnsi="Times New Roman"/>
+          <w:sz w:val="24"/>
+        </w:rPr>
+        <w:t>)</w:t>
       </w:r>
     </w:p>
     <w:p>
       <w:pPr>
         <w:pStyle w:val="BodyText"/>
         <w:widowControl/>
+        <w:spacing w:line="360" w:lineRule="auto" w:after="120"/>
+        <w:ind w:firstLine="709"/>
+        <w:jc w:val="both"/>
       </w:pPr>
       <w:r>
         <w:rPr>
           <w:rFonts w:ascii="Times New Roman" w:hAnsi="Times New Roman"/>
           <w:i w:val="0"/>
-        </w:rPr>
-        <w:t xml:space="preserve">Para o Sol acima do horizonte e para definições radiométricas compatíveis, o balanço geométrico ideal é</w:t>
+          <w:color w:val="000000"/>
+          <w:sz w:val="24"/>
+        </w:rPr>
+        <w:t xml:space="preserve">em que GHI é a irradiância global horizontal, DNI é a irradiância direta normal e DHI é a irradiância difusa horizontal, todas em W/m²;</w:t>
+      </w:r>
+      <w:r>
+        <w:rPr>
+          <w:rFonts w:ascii="Times New Roman" w:hAnsi="Times New Roman"/>
+          <w:i w:val="0"/>
+          <w:color w:val="000000"/>
+          <w:sz w:val="24"/>
+        </w:rPr>
+        <w:t xml:space="preserve"> </w:t>
+      </w:r>
+      <m:oMath>
+        <m:sSub>
+          <m:e>
+            <m:r>
+              <w:rPr>
+                <w:sz w:val="24"/>
+                <w:szCs w:val="24"/>
+              </w:rPr>
+              <m:t>θ</m:t>
+            </m:r>
+          </m:e>
+          <m:sub>
+            <m:r>
+              <w:rPr>
+                <w:sz w:val="24"/>
+                <w:szCs w:val="24"/>
+              </w:rPr>
+              <m:t>z</m:t>
+            </m:r>
+          </m:sub>
+        </m:sSub>
+      </m:oMath>
+      <w:r>
+        <w:rPr>
+          <w:rFonts w:ascii="Times New Roman" w:hAnsi="Times New Roman"/>
+          <w:i w:val="0"/>
+          <w:color w:val="000000"/>
+          <w:sz w:val="24"/>
+        </w:rPr>
+        <w:t xml:space="preserve"> </w:t>
+      </w:r>
+      <w:r>
+        <w:rPr>
+          <w:rFonts w:ascii="Times New Roman" w:hAnsi="Times New Roman"/>
+          <w:i w:val="0"/>
+          <w:color w:val="000000"/>
+          <w:sz w:val="24"/>
+        </w:rPr>
+        <w:t xml:space="preserve">é o ângulo zenital; e</w:t>
+      </w:r>
+      <w:r>
+        <w:rPr>
+          <w:rFonts w:ascii="Times New Roman" w:hAnsi="Times New Roman"/>
+          <w:i w:val="0"/>
+          <w:color w:val="000000"/>
+          <w:sz w:val="24"/>
+        </w:rPr>
+        <w:t xml:space="preserve"> </w:t>
+      </w:r>
+      <m:oMath>
+        <m:r>
+          <m:rPr>
+            <m:sty m:val="p"/>
+          </m:rPr>
+          <w:rPr>
+            <w:sz w:val="24"/>
+            <w:szCs w:val="24"/>
+          </w:rPr>
+          <m:t>D</m:t>
+        </m:r>
+        <m:r>
+          <m:rPr>
+            <m:sty m:val="p"/>
+          </m:rPr>
+          <w:rPr>
+            <w:sz w:val="24"/>
+            <w:szCs w:val="24"/>
+          </w:rPr>
+          <m:t>N</m:t>
+        </m:r>
+        <m:r>
+          <m:rPr>
+            <m:sty m:val="p"/>
+          </m:rPr>
+          <w:rPr>
+            <w:sz w:val="24"/>
+            <w:szCs w:val="24"/>
+          </w:rPr>
+          <m:t>I</m:t>
+        </m:r>
+        <m:r>
+          <m:rPr>
+            <m:sty m:val="p"/>
+          </m:rPr>
+          <w:rPr>
+            <w:sz w:val="24"/>
+            <w:szCs w:val="24"/>
+          </w:rPr>
+          <m:t>cos</m:t>
+        </m:r>
+        <m:sSub>
+          <m:e>
+            <m:r>
+              <w:rPr>
+                <w:sz w:val="24"/>
+                <w:szCs w:val="24"/>
+              </w:rPr>
+              <m:t>θ</m:t>
+            </m:r>
+          </m:e>
+          <m:sub>
+            <m:r>
+              <w:rPr>
+                <w:sz w:val="24"/>
+                <w:szCs w:val="24"/>
+              </w:rPr>
+              <m:t>z</m:t>
+            </m:r>
+          </m:sub>
+        </m:sSub>
+      </m:oMath>
+      <w:r>
+        <w:rPr>
+          <w:rFonts w:ascii="Times New Roman" w:hAnsi="Times New Roman"/>
+          <w:i w:val="0"/>
+          <w:color w:val="000000"/>
+          <w:sz w:val="24"/>
+        </w:rPr>
+        <w:t xml:space="preserve"> </w:t>
+      </w:r>
+      <w:r>
+        <w:rPr>
+          <w:rFonts w:ascii="Times New Roman" w:hAnsi="Times New Roman"/>
+          <w:i w:val="0"/>
+          <w:color w:val="000000"/>
+          <w:sz w:val="24"/>
+        </w:rPr>
+        <w:t xml:space="preserve">é a contribuição direta projetada na horizontal. A relação pressupõe o Sol acima do horizonte e definições compatíveis de banda espectral, campo angular, plano e suporte temporal.</w:t>
+      </w:r>
+    </w:p>
+    <w:p>
+      <w:pPr>
+        <w:pStyle w:val="FirstParagraph"/>
+        <w:widowControl/>
+        <w:spacing w:line="360" w:lineRule="auto" w:after="120"/>
+        <w:ind w:firstLine="709"/>
+      </w:pPr>
+      <w:r>
+        <w:rPr>
+          <w:rFonts w:ascii="Times New Roman" w:hAnsi="Times New Roman"/>
+          <w:i w:val="0"/>
+          <w:color w:val="000000"/>
+          <w:sz w:val="24"/>
+        </w:rPr>
+        <w:t xml:space="preserve">A equação deve utilizar um ângulo solar coerente com a aplicação, distinguindo a geometria da refração quando necessário. No fechamento de medidas reais, também importam o campo de visão do pireliômetro, o sombreamento aplicado ao sensor de DHI, a resposta angular dos sensores e sua sincronização. Por isso, um resíduo entre os termos medidos não pode ser atribuído automaticamente a uma falha atmosférica ou a um único instrumento (SENGUPTA et al., 2024, cap. 2, p. 10; cap. 3, p. 5–7).</w:t>
       </w:r>
     </w:p>
     <w:p>
       <w:pPr>
         <w:pStyle w:val="BodyText"/>
         <w:widowControl/>
-        <w:spacing w:before="120" w:after="140"/>
-        <w:ind w:firstLine="0"/>
-        <w:jc w:val="center"/>
+        <w:spacing w:line="360" w:lineRule="auto" w:after="120"/>
+        <w:ind w:firstLine="709"/>
       </w:pPr>
-      <m:oMathPara>
-        <m:oMathParaPr>
-          <m:jc m:val="center"/>
-        </m:oMathParaPr>
-        <m:oMath>
-          <m:r>
-            <w:rPr>
-              <w:sz w:val="32"/>
-            </w:rPr>
-            <m:rPr>
-              <m:sty m:val="p"/>
-            </m:rPr>
-            <m:t>G</m:t>
-          </m:r>
-          <m:r>
-            <w:rPr>
-              <w:sz w:val="32"/>
-            </w:rPr>
-            <m:rPr>
-              <m:sty m:val="p"/>
-            </m:rPr>
-            <m:t>H</m:t>
-          </m:r>
-          <m:r>
-            <w:rPr>
-              <w:sz w:val="32"/>
-            </w:rPr>
-            <m:rPr>
-              <m:sty m:val="p"/>
-            </m:rPr>
-            <m:t>I</m:t>
-          </m:r>
-          <m:r>
-            <w:rPr>
-              <w:sz w:val="32"/>
-            </w:rPr>
-            <m:rPr>
-              <m:sty m:val="p"/>
-            </m:rPr>
-            <m:t>=</m:t>
-          </m:r>
-          <m:r>
-            <w:rPr>
-              <w:sz w:val="32"/>
-            </w:rPr>
-            <m:rPr>
-              <m:sty m:val="p"/>
-            </m:rPr>
-            <m:t>D</m:t>
-          </m:r>
-          <m:r>
-            <w:rPr>
-              <w:sz w:val="32"/>
-            </w:rPr>
-            <m:rPr>
-              <m:sty m:val="p"/>
-            </m:rPr>
-            <m:t>N</m:t>
-          </m:r>
-          <m:r>
-            <w:rPr>
-              <w:sz w:val="32"/>
-            </w:rPr>
-            <m:rPr>
-              <m:sty m:val="p"/>
-            </m:rPr>
-            <m:t>I</m:t>
-          </m:r>
-          <m:r>
-            <w:rPr>
-              <w:sz w:val="32"/>
-            </w:rPr>
-            <m:rPr>
-              <m:sty m:val="p"/>
-            </m:rPr>
-            <m:t>cos</m:t>
-          </m:r>
-          <m:sSub>
-            <m:e>
-              <m:r>
-                <w:rPr>
-                  <w:sz w:val="32"/>
-                </w:rPr>
-                <m:t>θ</m:t>
-              </m:r>
-            </m:e>
-            <m:sub>
-              <m:r>
-                <w:rPr>
-                  <w:sz w:val="32"/>
-                </w:rPr>
-                <m:t>z</m:t>
-              </m:r>
-            </m:sub>
-          </m:sSub>
-          <m:r>
-            <w:rPr>
-              <w:sz w:val="32"/>
-            </w:rPr>
-            <m:rPr>
-              <m:sty m:val="p"/>
-            </m:rPr>
-            <m:t>+</m:t>
-          </m:r>
-          <m:r>
-            <w:rPr>
-              <w:sz w:val="32"/>
-            </w:rPr>
-            <m:rPr>
-              <m:sty m:val="p"/>
-            </m:rPr>
-            <m:t>D</m:t>
-          </m:r>
-          <m:r>
-            <w:rPr>
-              <w:sz w:val="32"/>
-            </w:rPr>
-            <m:rPr>
-              <m:sty m:val="p"/>
-            </m:rPr>
-            <m:t>H</m:t>
-          </m:r>
-          <m:r>
-            <w:rPr>
-              <w:sz w:val="32"/>
-            </w:rPr>
-            <m:rPr>
-              <m:sty m:val="p"/>
-            </m:rPr>
-            <m:t>I</m:t>
-          </m:r>
-          <m:r>
-            <w:rPr>
-              <w:sz w:val="32"/>
-            </w:rPr>
-            <m:rPr>
-              <m:sty m:val="p"/>
-            </m:rPr>
-            <m:t>.</m:t>
-          </m:r>
-          <m:r>
-            <w:rPr>
-              <w:sz w:val="32"/>
-            </w:rPr>
-            <m:rPr>
-              <m:sty m:val="p"/>
-            </m:rPr>
-            <m:t>   (E1.05)</m:t>
-          </m:r>
-        </m:oMath>
-      </m:oMathPara>
-    </w:p>
-    <w:p>
-      <w:pPr>
-        <w:pStyle w:val="FirstParagraph"/>
-        <w:widowControl/>
-      </w:pPr>
-      <w:r>
-        <w:rPr>
-          <w:rFonts w:ascii="Times New Roman" w:hAnsi="Times New Roman"/>
-          <w:i w:val="0"/>
-        </w:rPr>
-        <w:t xml:space="preserve">O produto</w:t>
-      </w:r>
-      <w:r>
-        <w:rPr>
-          <w:rFonts w:ascii="Times New Roman" w:hAnsi="Times New Roman"/>
-          <w:i w:val="0"/>
+      <w:r>
+        <w:rPr>
+          <w:rFonts w:ascii="Times New Roman" w:hAnsi="Times New Roman"/>
+          <w:i w:val="0"/>
+          <w:color w:val="000000"/>
+          <w:sz w:val="24"/>
+        </w:rPr>
+        <w:t xml:space="preserve">A equação de fechamento é uma restrição física útil, mas não transforma uma medição isolada de GHI em três observações independentes. A estimação de DNI e DHI a partir de GHI requer modelos de decomposição, cuja validade depende de condições e escalas temporais. Próximo ao horizonte, estimar DNI pela divisão da componente direta horizontal por</w:t>
+      </w:r>
+      <w:r>
+        <w:rPr>
+          <w:rFonts w:ascii="Times New Roman" w:hAnsi="Times New Roman"/>
+          <w:i w:val="0"/>
+          <w:color w:val="000000"/>
+          <w:sz w:val="24"/>
         </w:rPr>
         <w:t xml:space="preserve"> </w:t>
       </w:r>
       <m:oMath>
         <m:r>
-          <w:rPr>
-            <w:sz w:val="28"/>
-          </w:rPr>
           <m:rPr>
             <m:sty m:val="p"/>
           </m:rPr>
-          <m:t>D</m:t>
-        </m:r>
-        <m:r>
-          <w:rPr>
-            <w:sz w:val="28"/>
-          </w:rPr>
-          <m:rPr>
-            <m:sty m:val="p"/>
-          </m:rPr>
-          <m:t>N</m:t>
-        </m:r>
-        <m:r>
-          <w:rPr>
-            <w:sz w:val="28"/>
-          </w:rPr>
-          <m:rPr>
-            <m:sty m:val="p"/>
-          </m:rPr>
-          <m:t>I</m:t>
-        </m:r>
-        <m:r>
-          <w:rPr>
-            <w:sz w:val="28"/>
-          </w:rPr>
-          <m:rPr>
-            <m:sty m:val="p"/>
-          </m:rPr>
+          <w:rPr>
+            <w:sz w:val="24"/>
+            <w:szCs w:val="24"/>
+          </w:rPr>
           <m:t>cos</m:t>
         </m:r>
         <m:sSub>
           <m:e>
             <m:r>
               <w:rPr>
-                <w:sz w:val="28"/>
+                <w:sz w:val="24"/>
+                <w:szCs w:val="24"/>
               </w:rPr>
               <m:t>θ</m:t>
             </m:r>
@@ -1162,7 +1828,8 @@
           <m:sub>
             <m:r>
               <w:rPr>
-                <w:sz w:val="28"/>
+                <w:sz w:val="24"/>
+                <w:szCs w:val="24"/>
               </w:rPr>
               <m:t>z</m:t>
             </m:r>
@@ -1173,6 +1840,8 @@
         <w:rPr>
           <w:rFonts w:ascii="Times New Roman" w:hAnsi="Times New Roman"/>
           <w:i w:val="0"/>
+          <w:color w:val="000000"/>
+          <w:sz w:val="24"/>
         </w:rPr>
         <w:t xml:space="preserve"> </w:t>
       </w:r>
@@ -1180,69 +1849,8 @@
         <w:rPr>
           <w:rFonts w:ascii="Times New Roman" w:hAnsi="Times New Roman"/>
           <w:i w:val="0"/>
-        </w:rPr>
-        <w:t xml:space="preserve">é a componente direta projetada na horizontal. A equação deve utilizar um ângulo solar coerente com a aplicação, distinguindo a geometria da refração quando necessário. No fechamento de medidas reais, também importam o campo de visão do pireliômetro, o sombreamento aplicado ao sensor de DHI, a resposta angular dos sensores e sua sincronização. Por isso, um resíduo entre os termos medidos não pode ser atribuído automaticamente a uma falha atmosférica ou a um único instrumento (SENGUPTA et al., 2024, cap. 2, p. 10; cap. 3, p. 5–7).</w:t>
-      </w:r>
-    </w:p>
-    <w:p>
-      <w:pPr>
-        <w:pStyle w:val="BodyText"/>
-        <w:widowControl/>
-      </w:pPr>
-      <w:r>
-        <w:rPr>
-          <w:rFonts w:ascii="Times New Roman" w:hAnsi="Times New Roman"/>
-          <w:i w:val="0"/>
-        </w:rPr>
-        <w:t xml:space="preserve">A equação de fechamento é uma restrição física útil, mas não transforma uma medição isolada de GHI em três observações independentes. A estimação de DNI e DHI a partir de GHI requer modelos de decomposição, cuja validade depende de condições e escalas temporais. Próximo ao horizonte, estimar DNI pela divisão da componente direta horizontal por</w:t>
-      </w:r>
-      <w:r>
-        <w:rPr>
-          <w:rFonts w:ascii="Times New Roman" w:hAnsi="Times New Roman"/>
-          <w:i w:val="0"/>
-        </w:rPr>
-        <w:t xml:space="preserve"> </w:t>
-      </w:r>
-      <m:oMath>
-        <m:r>
-          <w:rPr>
-            <w:sz w:val="28"/>
-          </w:rPr>
-          <m:rPr>
-            <m:sty m:val="p"/>
-          </m:rPr>
-          <m:t>cos</m:t>
-        </m:r>
-        <m:sSub>
-          <m:e>
-            <m:r>
-              <w:rPr>
-                <w:sz w:val="28"/>
-              </w:rPr>
-              <m:t>θ</m:t>
-            </m:r>
-          </m:e>
-          <m:sub>
-            <m:r>
-              <w:rPr>
-                <w:sz w:val="28"/>
-              </w:rPr>
-              <m:t>z</m:t>
-            </m:r>
-          </m:sub>
-        </m:sSub>
-      </m:oMath>
-      <w:r>
-        <w:rPr>
-          <w:rFonts w:ascii="Times New Roman" w:hAnsi="Times New Roman"/>
-          <w:i w:val="0"/>
-        </w:rPr>
-        <w:t xml:space="preserve"> </w:t>
-      </w:r>
-      <w:r>
-        <w:rPr>
-          <w:rFonts w:ascii="Times New Roman" w:hAnsi="Times New Roman"/>
-          <w:i w:val="0"/>
+          <w:color w:val="000000"/>
+          <w:sz w:val="24"/>
         </w:rPr>
         <w:t xml:space="preserve">amplifica a sensibilidade a pequenos erros, pois o denominador tende a zero. A caracterização das componentes deve, portanto, manter explícita a distinção entre valores medidos e estimados (SENGUPTA et al., 2024, cap. 2, p. 10–11).</w:t>
       </w:r>
@@ -1252,11 +1860,18 @@
     <w:p>
       <w:pPr>
         <w:pStyle w:val="Heading2"/>
+        <w:keepNext/>
         <w:widowControl/>
+        <w:spacing w:line="360" w:lineRule="auto" w:after="120"/>
+        <w:ind w:firstLine="0"/>
       </w:pPr>
       <w:r>
         <w:rPr>
+          <w:rFonts w:ascii="Times New Roman" w:hAnsi="Times New Roman"/>
           <w:b/>
+          <w:i w:val="0"/>
+          <w:color w:val="000000"/>
+          <w:sz w:val="24"/>
         </w:rPr>
         <w:t>1.2.3 REFERÊNCIA EXTRATERRESTRE E IRRADIÂNCIA NO PLANO DO ARRANJO</w:t>
       </w:r>
@@ -1265,11 +1880,15 @@
       <w:pPr>
         <w:pStyle w:val="FirstParagraph"/>
         <w:widowControl/>
+        <w:spacing w:line="360" w:lineRule="auto" w:after="120"/>
+        <w:ind w:firstLine="709"/>
       </w:pPr>
       <w:r>
         <w:rPr>
           <w:rFonts w:ascii="Times New Roman" w:hAnsi="Times New Roman"/>
           <w:i w:val="0"/>
+          <w:color w:val="000000"/>
+          <w:sz w:val="24"/>
         </w:rPr>
         <w:t xml:space="preserve">A irradiância extraterrestre normal</w:t>
       </w:r>
@@ -1277,6 +1896,8 @@
         <w:rPr>
           <w:rFonts w:ascii="Times New Roman" w:hAnsi="Times New Roman"/>
           <w:i w:val="0"/>
+          <w:color w:val="000000"/>
+          <w:sz w:val="24"/>
         </w:rPr>
         <w:t xml:space="preserve"> </w:t>
       </w:r>
@@ -1285,7 +1906,8 @@
           <m:e>
             <m:r>
               <w:rPr>
-                <w:sz w:val="28"/>
+                <w:sz w:val="24"/>
+                <w:szCs w:val="24"/>
               </w:rPr>
               <m:t>G</m:t>
             </m:r>
@@ -1293,13 +1915,15 @@
           <m:sub>
             <m:r>
               <w:rPr>
-                <w:sz w:val="28"/>
+                <w:sz w:val="24"/>
+                <w:szCs w:val="24"/>
               </w:rPr>
               <m:t>0</m:t>
             </m:r>
             <m:r>
               <w:rPr>
-                <w:sz w:val="28"/>
+                <w:sz w:val="24"/>
+                <w:szCs w:val="24"/>
               </w:rPr>
               <m:t>n</m:t>
             </m:r>
@@ -1310,6 +1934,8 @@
         <w:rPr>
           <w:rFonts w:ascii="Times New Roman" w:hAnsi="Times New Roman"/>
           <w:i w:val="0"/>
+          <w:color w:val="000000"/>
+          <w:sz w:val="24"/>
         </w:rPr>
         <w:t xml:space="preserve"> </w:t>
       </w:r>
@@ -1317,6 +1943,8 @@
         <w:rPr>
           <w:rFonts w:ascii="Times New Roman" w:hAnsi="Times New Roman"/>
           <w:i w:val="0"/>
+          <w:color w:val="000000"/>
+          <w:sz w:val="24"/>
         </w:rPr>
         <w:t xml:space="preserve">e sua projeção horizontal</w:t>
       </w:r>
@@ -1324,6 +1952,8 @@
         <w:rPr>
           <w:rFonts w:ascii="Times New Roman" w:hAnsi="Times New Roman"/>
           <w:i w:val="0"/>
+          <w:color w:val="000000"/>
+          <w:sz w:val="24"/>
         </w:rPr>
         <w:t xml:space="preserve"> </w:t>
       </w:r>
@@ -1332,7 +1962,8 @@
           <m:e>
             <m:r>
               <w:rPr>
-                <w:sz w:val="28"/>
+                <w:sz w:val="24"/>
+                <w:szCs w:val="24"/>
               </w:rPr>
               <m:t>G</m:t>
             </m:r>
@@ -1340,13 +1971,15 @@
           <m:sub>
             <m:r>
               <w:rPr>
-                <w:sz w:val="28"/>
+                <w:sz w:val="24"/>
+                <w:szCs w:val="24"/>
               </w:rPr>
               <m:t>0</m:t>
             </m:r>
             <m:r>
               <w:rPr>
-                <w:sz w:val="28"/>
+                <w:sz w:val="24"/>
+                <w:szCs w:val="24"/>
               </w:rPr>
               <m:t>h</m:t>
             </m:r>
@@ -1357,6 +1990,8 @@
         <w:rPr>
           <w:rFonts w:ascii="Times New Roman" w:hAnsi="Times New Roman"/>
           <w:i w:val="0"/>
+          <w:color w:val="000000"/>
+          <w:sz w:val="24"/>
         </w:rPr>
         <w:t xml:space="preserve">, definidas em 1.1, constituem referências anteriores à interação com a atmosfera. A presença do mesmo plano horizontal em</w:t>
       </w:r>
@@ -1364,6 +1999,8 @@
         <w:rPr>
           <w:rFonts w:ascii="Times New Roman" w:hAnsi="Times New Roman"/>
           <w:i w:val="0"/>
+          <w:color w:val="000000"/>
+          <w:sz w:val="24"/>
         </w:rPr>
         <w:t xml:space="preserve"> </w:t>
       </w:r>
@@ -1372,7 +2009,8 @@
           <m:e>
             <m:r>
               <w:rPr>
-                <w:sz w:val="28"/>
+                <w:sz w:val="24"/>
+                <w:szCs w:val="24"/>
               </w:rPr>
               <m:t>G</m:t>
             </m:r>
@@ -1380,13 +2018,15 @@
           <m:sub>
             <m:r>
               <w:rPr>
-                <w:sz w:val="28"/>
+                <w:sz w:val="24"/>
+                <w:szCs w:val="24"/>
               </w:rPr>
               <m:t>0</m:t>
             </m:r>
             <m:r>
               <w:rPr>
-                <w:sz w:val="28"/>
+                <w:sz w:val="24"/>
+                <w:szCs w:val="24"/>
               </w:rPr>
               <m:t>h</m:t>
             </m:r>
@@ -1397,6 +2037,8 @@
         <w:rPr>
           <w:rFonts w:ascii="Times New Roman" w:hAnsi="Times New Roman"/>
           <w:i w:val="0"/>
+          <w:color w:val="000000"/>
+          <w:sz w:val="24"/>
         </w:rPr>
         <w:t xml:space="preserve"> </w:t>
       </w:r>
@@ -1404,6 +2046,8 @@
         <w:rPr>
           <w:rFonts w:ascii="Times New Roman" w:hAnsi="Times New Roman"/>
           <w:i w:val="0"/>
+          <w:color w:val="000000"/>
+          <w:sz w:val="24"/>
         </w:rPr>
         <w:t xml:space="preserve">e GHI não as torna equivalentes: a primeira representa a projeção extraterrestre, enquanto a segunda descreve o campo radiativo disponível na superfície. Também não se deve impor que toda observação de curta duração seja necessariamente inferior a essa projeção, pois a redistribuição por nuvens pode produzir episódios de intensificação local da irradiância global (DUFFIE; BECKMAN; BLAIR, 2020, p. 9–10; SENGUPTA et al., 2024, cap. 6, p. 2).</w:t>
       </w:r>
@@ -1412,34 +2056,61 @@
       <w:pPr>
         <w:pStyle w:val="BodyText"/>
         <w:widowControl/>
+        <w:spacing w:line="360" w:lineRule="auto" w:after="120"/>
+        <w:ind w:firstLine="709"/>
       </w:pPr>
       <w:r>
         <w:rPr>
           <w:rFonts w:ascii="Times New Roman" w:hAnsi="Times New Roman"/>
           <w:i w:val="0"/>
+          <w:color w:val="000000"/>
+          <w:sz w:val="24"/>
         </w:rPr>
         <w:t xml:space="preserve">A irradiância no plano do arranjo, POA, é referida à superfície dos módulos, que pode ser inclinada ou rastreada. Sua descrição separa a contribuição direta projetada nesse plano, a difusa proveniente do céu e a refletida pelo entorno. Essa separação conceitual identifica a natureza das parcelas sem impor um modelo de distribuição angular da radiação difusa. O cálculo de transposição e suas hipóteses pertencem à subseção 3.1; o albedo e a instalação são desenvolvidos nas subseções 2.2 e 2.4. A Seção 1 estabelece as grandezas necessárias a essas etapas, sem antecipar seus resultados (SENGUPTA et al., 2024, cap. 2, p. 1 e 9–11).</w:t>
+      </w:r>
+      <w:r>
+        <w:t xml:space="preserve"> O Quadro 1 sintetiza essas grandezas e convenções.</w:t>
+      </w:r>
+    </w:p>
+    <w:p>
+      <w:pPr>
+        <w:keepNext/>
+        <w:widowControl/>
+        <w:spacing w:line="240" w:lineRule="auto" w:after="80" w:before="160"/>
+        <w:ind w:firstLine="0" w:left="227" w:right="227"/>
+        <w:jc w:val="center"/>
+      </w:pPr>
+      <w:r>
+        <w:rPr>
+          <w:rFonts w:ascii="Times New Roman" w:hAnsi="Times New Roman"/>
+          <w:b/>
+          <w:i w:val="0"/>
+          <w:color w:val="000000"/>
+          <w:sz w:val="20"/>
+        </w:rPr>
+        <w:t>Quadro 1 – Grandezas radiométricas e planos de referência</w:t>
       </w:r>
     </w:p>
     <w:tbl>
       <w:tblPr>
         <w:tblStyle w:val="Table"/>
-        <w:tblW w:type="pct" w:w="5000"/>
+        <w:tblW w:type="dxa" w:w="8617"/>
+        <w:tblLayout w:type="fixed"/>
         <w:tblLook w:firstRow="1" w:lastRow="0" w:firstColumn="0" w:lastColumn="0" w:noHBand="0" w:noVBand="0" w:val="0020"/>
-        <w:jc w:val="start"/>
+        <w:jc w:val="center"/>
         <w:tblBorders>
-          <w:top w:val="single" w:sz="4" w:color="D9D9D9"/>
-          <w:left w:val="single" w:sz="4" w:color="D9D9D9"/>
-          <w:bottom w:val="single" w:sz="4" w:color="D9D9D9"/>
-          <w:right w:val="single" w:sz="4" w:color="D9D9D9"/>
-          <w:insideH w:val="single" w:sz="4" w:color="D9D9D9"/>
-          <w:insideV w:val="single" w:sz="4" w:color="D9D9D9"/>
+          <w:top w:val="single" w:sz="8" w:color="000000"/>
+          <w:left w:val="single" w:sz="8" w:color="000000"/>
+          <w:bottom w:val="single" w:sz="8" w:color="000000"/>
+          <w:right w:val="single" w:sz="8" w:color="000000"/>
+          <w:insideH w:val="single" w:sz="8" w:color="000000"/>
+          <w:insideV w:val="single" w:sz="8" w:color="000000"/>
         </w:tblBorders>
       </w:tblPr>
       <w:tblGrid>
-        <w:gridCol w:w="2640"/>
-        <w:gridCol w:w="2640"/>
-        <w:gridCol w:w="2640"/>
+        <w:gridCol w:w="1531"/>
+        <w:gridCol w:w="4535"/>
+        <w:gridCol w:w="2551"/>
       </w:tblGrid>
       <w:tr>
         <w:trPr>
@@ -1449,20 +2120,32 @@
         </w:trPr>
         <w:tc>
           <w:tcPr>
+            <w:tcW w:type="dxa" w:w="1531"/>
             <w:shd w:fill="F0F0F0"/>
+            <w:vAlign w:val="center"/>
+            <w:tcMar>
+              <w:top w:w="70" w:type="dxa"/>
+              <w:bottom w:w="70" w:type="dxa"/>
+              <w:left w:w="100" w:type="dxa"/>
+              <w:right w:w="100" w:type="dxa"/>
+            </w:tcMar>
           </w:tcPr>
           <w:p>
             <w:pPr>
               <w:pStyle w:val="Compact"/>
-              <w:spacing w:line="264" w:lineRule="auto"/>
+              <w:keepNext/>
+              <w:widowControl/>
+              <w:spacing w:line="240" w:lineRule="auto" w:after="0"/>
               <w:ind w:firstLine="0"/>
-              <w:jc w:val="left"/>
+              <w:jc w:val="center"/>
             </w:pPr>
             <w:r>
               <w:rPr>
                 <w:rFonts w:ascii="Times New Roman" w:hAnsi="Times New Roman"/>
                 <w:b/>
-                <w:sz w:val="23"/>
+                <w:i w:val="0"/>
+                <w:color w:val="000000"/>
+                <w:sz w:val="24"/>
               </w:rPr>
               <w:t xml:space="preserve">Grandeza</w:t>
             </w:r>
@@ -1470,12 +2153,22 @@
         </w:tc>
         <w:tc>
           <w:tcPr>
+            <w:tcW w:type="dxa" w:w="4535"/>
             <w:shd w:fill="F0F0F0"/>
+            <w:vAlign w:val="center"/>
+            <w:tcMar>
+              <w:top w:w="70" w:type="dxa"/>
+              <w:bottom w:w="70" w:type="dxa"/>
+              <w:left w:w="100" w:type="dxa"/>
+              <w:right w:w="100" w:type="dxa"/>
+            </w:tcMar>
           </w:tcPr>
           <w:p>
             <w:pPr>
               <w:pStyle w:val="Compact"/>
-              <w:spacing w:line="264" w:lineRule="auto"/>
+              <w:keepNext/>
+              <w:widowControl/>
+              <w:spacing w:line="240" w:lineRule="auto" w:after="0"/>
               <w:ind w:firstLine="0"/>
               <w:jc w:val="left"/>
             </w:pPr>
@@ -1483,7 +2176,9 @@
               <w:rPr>
                 <w:rFonts w:ascii="Times New Roman" w:hAnsi="Times New Roman"/>
                 <w:b/>
-                <w:sz w:val="23"/>
+                <w:i w:val="0"/>
+                <w:color w:val="000000"/>
+                <w:sz w:val="24"/>
               </w:rPr>
               <w:t xml:space="preserve">Definição e plano</w:t>
             </w:r>
@@ -1491,20 +2186,32 @@
         </w:tc>
         <w:tc>
           <w:tcPr>
+            <w:tcW w:type="dxa" w:w="2551"/>
             <w:shd w:fill="F0F0F0"/>
+            <w:vAlign w:val="center"/>
+            <w:tcMar>
+              <w:top w:w="70" w:type="dxa"/>
+              <w:bottom w:w="70" w:type="dxa"/>
+              <w:left w:w="100" w:type="dxa"/>
+              <w:right w:w="100" w:type="dxa"/>
+            </w:tcMar>
           </w:tcPr>
           <w:p>
             <w:pPr>
               <w:pStyle w:val="Compact"/>
-              <w:spacing w:line="264" w:lineRule="auto"/>
+              <w:keepNext/>
+              <w:widowControl/>
+              <w:spacing w:line="240" w:lineRule="auto" w:after="0"/>
               <w:ind w:firstLine="0"/>
-              <w:jc w:val="left"/>
+              <w:jc w:val="center"/>
             </w:pPr>
             <w:r>
               <w:rPr>
                 <w:rFonts w:ascii="Times New Roman" w:hAnsi="Times New Roman"/>
                 <w:b/>
-                <w:sz w:val="23"/>
+                <w:i w:val="0"/>
+                <w:color w:val="000000"/>
+                <w:sz w:val="24"/>
               </w:rPr>
               <w:t xml:space="preserve">Unidade</w:t>
             </w:r>
@@ -1516,26 +2223,49 @@
           <w:cantSplit/>
         </w:trPr>
         <w:tc>
-          <w:tcPr/>
+          <w:tcPr>
+            <w:tcW w:type="dxa" w:w="1531"/>
+            <w:vAlign w:val="center"/>
+            <w:tcMar>
+              <w:top w:w="70" w:type="dxa"/>
+              <w:bottom w:w="70" w:type="dxa"/>
+              <w:left w:w="100" w:type="dxa"/>
+              <w:right w:w="100" w:type="dxa"/>
+            </w:tcMar>
+          </w:tcPr>
           <w:p>
             <w:pPr>
               <w:pStyle w:val="Compact"/>
-              <w:spacing w:line="264" w:lineRule="auto"/>
+              <w:keepNext/>
+              <w:widowControl/>
+              <w:spacing w:line="240" w:lineRule="auto" w:after="0"/>
               <w:ind w:firstLine="0"/>
-              <w:jc w:val="left"/>
+              <w:jc w:val="center"/>
             </w:pPr>
             <m:oMath>
               <m:sSub>
                 <m:e>
                   <m:r>
+                    <w:rPr>
+                      <w:sz w:val="24"/>
+                      <w:szCs w:val="24"/>
+                    </w:rPr>
                     <m:t>G</m:t>
                   </m:r>
                 </m:e>
                 <m:sub>
                   <m:r>
+                    <w:rPr>
+                      <w:sz w:val="24"/>
+                      <w:szCs w:val="24"/>
+                    </w:rPr>
                     <m:t>0</m:t>
                   </m:r>
                   <m:r>
+                    <w:rPr>
+                      <w:sz w:val="24"/>
+                      <w:szCs w:val="24"/>
+                    </w:rPr>
                     <m:t>n</m:t>
                   </m:r>
                 </m:sub>
@@ -1544,36 +2274,64 @@
           </w:p>
         </w:tc>
         <w:tc>
-          <w:tcPr/>
+          <w:tcPr>
+            <w:tcW w:type="dxa" w:w="4535"/>
+            <w:vAlign w:val="center"/>
+            <w:tcMar>
+              <w:top w:w="70" w:type="dxa"/>
+              <w:bottom w:w="70" w:type="dxa"/>
+              <w:left w:w="100" w:type="dxa"/>
+              <w:right w:w="100" w:type="dxa"/>
+            </w:tcMar>
+          </w:tcPr>
           <w:p>
             <w:pPr>
               <w:pStyle w:val="Compact"/>
-              <w:spacing w:line="264" w:lineRule="auto"/>
+              <w:keepNext/>
+              <w:widowControl/>
+              <w:spacing w:line="240" w:lineRule="auto" w:after="0"/>
               <w:ind w:firstLine="0"/>
               <w:jc w:val="left"/>
             </w:pPr>
             <w:r>
               <w:rPr>
                 <w:rFonts w:ascii="Times New Roman" w:hAnsi="Times New Roman"/>
-                <w:sz w:val="23"/>
+                <w:b w:val="0"/>
+                <w:i w:val="0"/>
+                <w:color w:val="000000"/>
+                <w:sz w:val="24"/>
               </w:rPr>
               <w:t xml:space="preserve">Irradiância extraterrestre normal ao feixe</w:t>
             </w:r>
           </w:p>
         </w:tc>
         <w:tc>
-          <w:tcPr/>
+          <w:tcPr>
+            <w:tcW w:type="dxa" w:w="2551"/>
+            <w:vAlign w:val="center"/>
+            <w:tcMar>
+              <w:top w:w="70" w:type="dxa"/>
+              <w:bottom w:w="70" w:type="dxa"/>
+              <w:left w:w="100" w:type="dxa"/>
+              <w:right w:w="100" w:type="dxa"/>
+            </w:tcMar>
+          </w:tcPr>
           <w:p>
             <w:pPr>
               <w:pStyle w:val="Compact"/>
-              <w:spacing w:line="264" w:lineRule="auto"/>
+              <w:keepNext/>
+              <w:widowControl/>
+              <w:spacing w:line="240" w:lineRule="auto" w:after="0"/>
               <w:ind w:firstLine="0"/>
-              <w:jc w:val="left"/>
+              <w:jc w:val="center"/>
             </w:pPr>
             <w:r>
               <w:rPr>
                 <w:rFonts w:ascii="Times New Roman" w:hAnsi="Times New Roman"/>
-                <w:sz w:val="23"/>
+                <w:b w:val="0"/>
+                <w:i w:val="0"/>
+                <w:color w:val="000000"/>
+                <w:sz w:val="24"/>
               </w:rPr>
               <w:t xml:space="preserve">W/m²</w:t>
             </w:r>
@@ -1585,26 +2343,49 @@
           <w:cantSplit/>
         </w:trPr>
         <w:tc>
-          <w:tcPr/>
+          <w:tcPr>
+            <w:tcW w:type="dxa" w:w="1531"/>
+            <w:vAlign w:val="center"/>
+            <w:tcMar>
+              <w:top w:w="70" w:type="dxa"/>
+              <w:bottom w:w="70" w:type="dxa"/>
+              <w:left w:w="100" w:type="dxa"/>
+              <w:right w:w="100" w:type="dxa"/>
+            </w:tcMar>
+          </w:tcPr>
           <w:p>
             <w:pPr>
               <w:pStyle w:val="Compact"/>
-              <w:spacing w:line="264" w:lineRule="auto"/>
+              <w:keepNext/>
+              <w:widowControl/>
+              <w:spacing w:line="240" w:lineRule="auto" w:after="0"/>
               <w:ind w:firstLine="0"/>
-              <w:jc w:val="left"/>
+              <w:jc w:val="center"/>
             </w:pPr>
             <m:oMath>
               <m:sSub>
                 <m:e>
                   <m:r>
+                    <w:rPr>
+                      <w:sz w:val="24"/>
+                      <w:szCs w:val="24"/>
+                    </w:rPr>
                     <m:t>G</m:t>
                   </m:r>
                 </m:e>
                 <m:sub>
                   <m:r>
+                    <w:rPr>
+                      <w:sz w:val="24"/>
+                      <w:szCs w:val="24"/>
+                    </w:rPr>
                     <m:t>0</m:t>
                   </m:r>
                   <m:r>
+                    <w:rPr>
+                      <w:sz w:val="24"/>
+                      <w:szCs w:val="24"/>
+                    </w:rPr>
                     <m:t>h</m:t>
                   </m:r>
                 </m:sub>
@@ -1613,36 +2394,64 @@
           </w:p>
         </w:tc>
         <w:tc>
-          <w:tcPr/>
+          <w:tcPr>
+            <w:tcW w:type="dxa" w:w="4535"/>
+            <w:vAlign w:val="center"/>
+            <w:tcMar>
+              <w:top w:w="70" w:type="dxa"/>
+              <w:bottom w:w="70" w:type="dxa"/>
+              <w:left w:w="100" w:type="dxa"/>
+              <w:right w:w="100" w:type="dxa"/>
+            </w:tcMar>
+          </w:tcPr>
           <w:p>
             <w:pPr>
               <w:pStyle w:val="Compact"/>
-              <w:spacing w:line="264" w:lineRule="auto"/>
+              <w:keepNext/>
+              <w:widowControl/>
+              <w:spacing w:line="240" w:lineRule="auto" w:after="0"/>
               <w:ind w:firstLine="0"/>
               <w:jc w:val="left"/>
             </w:pPr>
             <w:r>
               <w:rPr>
                 <w:rFonts w:ascii="Times New Roman" w:hAnsi="Times New Roman"/>
-                <w:sz w:val="23"/>
+                <w:b w:val="0"/>
+                <w:i w:val="0"/>
+                <w:color w:val="000000"/>
+                <w:sz w:val="24"/>
               </w:rPr>
               <w:t xml:space="preserve">Projeção extraterrestre na horizontal</w:t>
             </w:r>
           </w:p>
         </w:tc>
         <w:tc>
-          <w:tcPr/>
+          <w:tcPr>
+            <w:tcW w:type="dxa" w:w="2551"/>
+            <w:vAlign w:val="center"/>
+            <w:tcMar>
+              <w:top w:w="70" w:type="dxa"/>
+              <w:bottom w:w="70" w:type="dxa"/>
+              <w:left w:w="100" w:type="dxa"/>
+              <w:right w:w="100" w:type="dxa"/>
+            </w:tcMar>
+          </w:tcPr>
           <w:p>
             <w:pPr>
               <w:pStyle w:val="Compact"/>
-              <w:spacing w:line="264" w:lineRule="auto"/>
+              <w:keepNext/>
+              <w:widowControl/>
+              <w:spacing w:line="240" w:lineRule="auto" w:after="0"/>
               <w:ind w:firstLine="0"/>
-              <w:jc w:val="left"/>
+              <w:jc w:val="center"/>
             </w:pPr>
             <w:r>
               <w:rPr>
                 <w:rFonts w:ascii="Times New Roman" w:hAnsi="Times New Roman"/>
-                <w:sz w:val="23"/>
+                <w:b w:val="0"/>
+                <w:i w:val="0"/>
+                <w:color w:val="000000"/>
+                <w:sz w:val="24"/>
               </w:rPr>
               <w:t xml:space="preserve">W/m²</w:t>
             </w:r>
@@ -1654,54 +2463,96 @@
           <w:cantSplit/>
         </w:trPr>
         <w:tc>
-          <w:tcPr/>
+          <w:tcPr>
+            <w:tcW w:type="dxa" w:w="1531"/>
+            <w:vAlign w:val="center"/>
+            <w:tcMar>
+              <w:top w:w="70" w:type="dxa"/>
+              <w:bottom w:w="70" w:type="dxa"/>
+              <w:left w:w="100" w:type="dxa"/>
+              <w:right w:w="100" w:type="dxa"/>
+            </w:tcMar>
+          </w:tcPr>
           <w:p>
             <w:pPr>
               <w:pStyle w:val="Compact"/>
-              <w:spacing w:line="264" w:lineRule="auto"/>
+              <w:keepNext/>
+              <w:widowControl/>
+              <w:spacing w:line="240" w:lineRule="auto" w:after="0"/>
               <w:ind w:firstLine="0"/>
-              <w:jc w:val="left"/>
+              <w:jc w:val="center"/>
             </w:pPr>
             <w:r>
               <w:rPr>
                 <w:rFonts w:ascii="Times New Roman" w:hAnsi="Times New Roman"/>
-                <w:sz w:val="23"/>
+                <w:b w:val="0"/>
+                <w:i w:val="0"/>
+                <w:color w:val="000000"/>
+                <w:sz w:val="24"/>
               </w:rPr>
               <w:t xml:space="preserve">DNI</w:t>
             </w:r>
           </w:p>
         </w:tc>
         <w:tc>
-          <w:tcPr/>
+          <w:tcPr>
+            <w:tcW w:type="dxa" w:w="4535"/>
+            <w:vAlign w:val="center"/>
+            <w:tcMar>
+              <w:top w:w="70" w:type="dxa"/>
+              <w:bottom w:w="70" w:type="dxa"/>
+              <w:left w:w="100" w:type="dxa"/>
+              <w:right w:w="100" w:type="dxa"/>
+            </w:tcMar>
+          </w:tcPr>
           <w:p>
             <w:pPr>
               <w:pStyle w:val="Compact"/>
-              <w:spacing w:line="264" w:lineRule="auto"/>
+              <w:keepNext/>
+              <w:widowControl/>
+              <w:spacing w:line="240" w:lineRule="auto" w:after="0"/>
               <w:ind w:firstLine="0"/>
               <w:jc w:val="left"/>
             </w:pPr>
             <w:r>
               <w:rPr>
                 <w:rFonts w:ascii="Times New Roman" w:hAnsi="Times New Roman"/>
-                <w:sz w:val="23"/>
+                <w:b w:val="0"/>
+                <w:i w:val="0"/>
+                <w:color w:val="000000"/>
+                <w:sz w:val="24"/>
               </w:rPr>
               <w:t xml:space="preserve">Componente direta referida à normal solar</w:t>
             </w:r>
           </w:p>
         </w:tc>
         <w:tc>
-          <w:tcPr/>
+          <w:tcPr>
+            <w:tcW w:type="dxa" w:w="2551"/>
+            <w:vAlign w:val="center"/>
+            <w:tcMar>
+              <w:top w:w="70" w:type="dxa"/>
+              <w:bottom w:w="70" w:type="dxa"/>
+              <w:left w:w="100" w:type="dxa"/>
+              <w:right w:w="100" w:type="dxa"/>
+            </w:tcMar>
+          </w:tcPr>
           <w:p>
             <w:pPr>
               <w:pStyle w:val="Compact"/>
-              <w:spacing w:line="264" w:lineRule="auto"/>
+              <w:keepNext/>
+              <w:widowControl/>
+              <w:spacing w:line="240" w:lineRule="auto" w:after="0"/>
               <w:ind w:firstLine="0"/>
-              <w:jc w:val="left"/>
+              <w:jc w:val="center"/>
             </w:pPr>
             <w:r>
               <w:rPr>
                 <w:rFonts w:ascii="Times New Roman" w:hAnsi="Times New Roman"/>
-                <w:sz w:val="23"/>
+                <w:b w:val="0"/>
+                <w:i w:val="0"/>
+                <w:color w:val="000000"/>
+                <w:sz w:val="24"/>
               </w:rPr>
               <w:t xml:space="preserve">W/m²</w:t>
             </w:r>
@@ -1713,54 +2564,96 @@
           <w:cantSplit/>
         </w:trPr>
         <w:tc>
-          <w:tcPr/>
+          <w:tcPr>
+            <w:tcW w:type="dxa" w:w="1531"/>
+            <w:vAlign w:val="center"/>
+            <w:tcMar>
+              <w:top w:w="70" w:type="dxa"/>
+              <w:bottom w:w="70" w:type="dxa"/>
+              <w:left w:w="100" w:type="dxa"/>
+              <w:right w:w="100" w:type="dxa"/>
+            </w:tcMar>
+          </w:tcPr>
           <w:p>
             <w:pPr>
               <w:pStyle w:val="Compact"/>
-              <w:spacing w:line="264" w:lineRule="auto"/>
+              <w:keepNext/>
+              <w:widowControl/>
+              <w:spacing w:line="240" w:lineRule="auto" w:after="0"/>
               <w:ind w:firstLine="0"/>
-              <w:jc w:val="left"/>
+              <w:jc w:val="center"/>
             </w:pPr>
             <w:r>
               <w:rPr>
                 <w:rFonts w:ascii="Times New Roman" w:hAnsi="Times New Roman"/>
-                <w:sz w:val="23"/>
+                <w:b w:val="0"/>
+                <w:i w:val="0"/>
+                <w:color w:val="000000"/>
+                <w:sz w:val="24"/>
               </w:rPr>
               <w:t xml:space="preserve">DHI</w:t>
             </w:r>
           </w:p>
         </w:tc>
         <w:tc>
-          <w:tcPr/>
+          <w:tcPr>
+            <w:tcW w:type="dxa" w:w="4535"/>
+            <w:vAlign w:val="center"/>
+            <w:tcMar>
+              <w:top w:w="70" w:type="dxa"/>
+              <w:bottom w:w="70" w:type="dxa"/>
+              <w:left w:w="100" w:type="dxa"/>
+              <w:right w:w="100" w:type="dxa"/>
+            </w:tcMar>
+          </w:tcPr>
           <w:p>
             <w:pPr>
               <w:pStyle w:val="Compact"/>
-              <w:spacing w:line="264" w:lineRule="auto"/>
+              <w:keepNext/>
+              <w:widowControl/>
+              <w:spacing w:line="240" w:lineRule="auto" w:after="0"/>
               <w:ind w:firstLine="0"/>
               <w:jc w:val="left"/>
             </w:pPr>
             <w:r>
               <w:rPr>
                 <w:rFonts w:ascii="Times New Roman" w:hAnsi="Times New Roman"/>
-                <w:sz w:val="23"/>
+                <w:b w:val="0"/>
+                <w:i w:val="0"/>
+                <w:color w:val="000000"/>
+                <w:sz w:val="24"/>
               </w:rPr>
               <w:t xml:space="preserve">Componente difusa recebida na horizontal</w:t>
             </w:r>
           </w:p>
         </w:tc>
         <w:tc>
-          <w:tcPr/>
+          <w:tcPr>
+            <w:tcW w:type="dxa" w:w="2551"/>
+            <w:vAlign w:val="center"/>
+            <w:tcMar>
+              <w:top w:w="70" w:type="dxa"/>
+              <w:bottom w:w="70" w:type="dxa"/>
+              <w:left w:w="100" w:type="dxa"/>
+              <w:right w:w="100" w:type="dxa"/>
+            </w:tcMar>
+          </w:tcPr>
           <w:p>
             <w:pPr>
               <w:pStyle w:val="Compact"/>
-              <w:spacing w:line="264" w:lineRule="auto"/>
+              <w:keepNext/>
+              <w:widowControl/>
+              <w:spacing w:line="240" w:lineRule="auto" w:after="0"/>
               <w:ind w:firstLine="0"/>
-              <w:jc w:val="left"/>
+              <w:jc w:val="center"/>
             </w:pPr>
             <w:r>
               <w:rPr>
                 <w:rFonts w:ascii="Times New Roman" w:hAnsi="Times New Roman"/>
-                <w:sz w:val="23"/>
+                <w:b w:val="0"/>
+                <w:i w:val="0"/>
+                <w:color w:val="000000"/>
+                <w:sz w:val="24"/>
               </w:rPr>
               <w:t xml:space="preserve">W/m²</w:t>
             </w:r>
@@ -1772,54 +2665,96 @@
           <w:cantSplit/>
         </w:trPr>
         <w:tc>
-          <w:tcPr/>
+          <w:tcPr>
+            <w:tcW w:type="dxa" w:w="1531"/>
+            <w:vAlign w:val="center"/>
+            <w:tcMar>
+              <w:top w:w="70" w:type="dxa"/>
+              <w:bottom w:w="70" w:type="dxa"/>
+              <w:left w:w="100" w:type="dxa"/>
+              <w:right w:w="100" w:type="dxa"/>
+            </w:tcMar>
+          </w:tcPr>
           <w:p>
             <w:pPr>
               <w:pStyle w:val="Compact"/>
-              <w:spacing w:line="264" w:lineRule="auto"/>
+              <w:keepNext/>
+              <w:widowControl/>
+              <w:spacing w:line="240" w:lineRule="auto" w:after="0"/>
               <w:ind w:firstLine="0"/>
-              <w:jc w:val="left"/>
+              <w:jc w:val="center"/>
             </w:pPr>
             <w:r>
               <w:rPr>
                 <w:rFonts w:ascii="Times New Roman" w:hAnsi="Times New Roman"/>
-                <w:sz w:val="23"/>
+                <w:b w:val="0"/>
+                <w:i w:val="0"/>
+                <w:color w:val="000000"/>
+                <w:sz w:val="24"/>
               </w:rPr>
               <w:t xml:space="preserve">GHI</w:t>
             </w:r>
           </w:p>
         </w:tc>
         <w:tc>
-          <w:tcPr/>
+          <w:tcPr>
+            <w:tcW w:type="dxa" w:w="4535"/>
+            <w:vAlign w:val="center"/>
+            <w:tcMar>
+              <w:top w:w="70" w:type="dxa"/>
+              <w:bottom w:w="70" w:type="dxa"/>
+              <w:left w:w="100" w:type="dxa"/>
+              <w:right w:w="100" w:type="dxa"/>
+            </w:tcMar>
+          </w:tcPr>
           <w:p>
             <w:pPr>
               <w:pStyle w:val="Compact"/>
-              <w:spacing w:line="264" w:lineRule="auto"/>
+              <w:keepNext/>
+              <w:widowControl/>
+              <w:spacing w:line="240" w:lineRule="auto" w:after="0"/>
               <w:ind w:firstLine="0"/>
               <w:jc w:val="left"/>
             </w:pPr>
             <w:r>
               <w:rPr>
                 <w:rFonts w:ascii="Times New Roman" w:hAnsi="Times New Roman"/>
-                <w:sz w:val="23"/>
+                <w:b w:val="0"/>
+                <w:i w:val="0"/>
+                <w:color w:val="000000"/>
+                <w:sz w:val="24"/>
               </w:rPr>
               <w:t xml:space="preserve">Irradiância global recebida na horizontal</w:t>
             </w:r>
           </w:p>
         </w:tc>
         <w:tc>
-          <w:tcPr/>
+          <w:tcPr>
+            <w:tcW w:type="dxa" w:w="2551"/>
+            <w:vAlign w:val="center"/>
+            <w:tcMar>
+              <w:top w:w="70" w:type="dxa"/>
+              <w:bottom w:w="70" w:type="dxa"/>
+              <w:left w:w="100" w:type="dxa"/>
+              <w:right w:w="100" w:type="dxa"/>
+            </w:tcMar>
+          </w:tcPr>
           <w:p>
             <w:pPr>
               <w:pStyle w:val="Compact"/>
-              <w:spacing w:line="264" w:lineRule="auto"/>
+              <w:keepNext/>
+              <w:widowControl/>
+              <w:spacing w:line="240" w:lineRule="auto" w:after="0"/>
               <w:ind w:firstLine="0"/>
-              <w:jc w:val="left"/>
+              <w:jc w:val="center"/>
             </w:pPr>
             <w:r>
               <w:rPr>
                 <w:rFonts w:ascii="Times New Roman" w:hAnsi="Times New Roman"/>
-                <w:sz w:val="23"/>
+                <w:b w:val="0"/>
+                <w:i w:val="0"/>
+                <w:color w:val="000000"/>
+                <w:sz w:val="24"/>
               </w:rPr>
               <w:t xml:space="preserve">W/m²</w:t>
             </w:r>
@@ -1831,54 +2766,96 @@
           <w:cantSplit/>
         </w:trPr>
         <w:tc>
-          <w:tcPr/>
+          <w:tcPr>
+            <w:tcW w:type="dxa" w:w="1531"/>
+            <w:vAlign w:val="center"/>
+            <w:tcMar>
+              <w:top w:w="70" w:type="dxa"/>
+              <w:bottom w:w="70" w:type="dxa"/>
+              <w:left w:w="100" w:type="dxa"/>
+              <w:right w:w="100" w:type="dxa"/>
+            </w:tcMar>
+          </w:tcPr>
           <w:p>
             <w:pPr>
               <w:pStyle w:val="Compact"/>
-              <w:spacing w:line="264" w:lineRule="auto"/>
+              <w:keepNext/>
+              <w:widowControl/>
+              <w:spacing w:line="240" w:lineRule="auto" w:after="0"/>
               <w:ind w:firstLine="0"/>
-              <w:jc w:val="left"/>
+              <w:jc w:val="center"/>
             </w:pPr>
             <w:r>
               <w:rPr>
                 <w:rFonts w:ascii="Times New Roman" w:hAnsi="Times New Roman"/>
-                <w:sz w:val="23"/>
+                <w:b w:val="0"/>
+                <w:i w:val="0"/>
+                <w:color w:val="000000"/>
+                <w:sz w:val="24"/>
               </w:rPr>
               <w:t xml:space="preserve">POA</w:t>
             </w:r>
           </w:p>
         </w:tc>
         <w:tc>
-          <w:tcPr/>
+          <w:tcPr>
+            <w:tcW w:type="dxa" w:w="4535"/>
+            <w:vAlign w:val="center"/>
+            <w:tcMar>
+              <w:top w:w="70" w:type="dxa"/>
+              <w:bottom w:w="70" w:type="dxa"/>
+              <w:left w:w="100" w:type="dxa"/>
+              <w:right w:w="100" w:type="dxa"/>
+            </w:tcMar>
+          </w:tcPr>
           <w:p>
             <w:pPr>
               <w:pStyle w:val="Compact"/>
-              <w:spacing w:line="264" w:lineRule="auto"/>
+              <w:keepNext/>
+              <w:widowControl/>
+              <w:spacing w:line="240" w:lineRule="auto" w:after="0"/>
               <w:ind w:firstLine="0"/>
               <w:jc w:val="left"/>
             </w:pPr>
             <w:r>
               <w:rPr>
                 <w:rFonts w:ascii="Times New Roman" w:hAnsi="Times New Roman"/>
-                <w:sz w:val="23"/>
+                <w:b w:val="0"/>
+                <w:i w:val="0"/>
+                <w:color w:val="000000"/>
+                <w:sz w:val="24"/>
               </w:rPr>
               <w:t xml:space="preserve">Irradiância recebida no plano do arranjo</w:t>
             </w:r>
           </w:p>
         </w:tc>
         <w:tc>
-          <w:tcPr/>
+          <w:tcPr>
+            <w:tcW w:type="dxa" w:w="2551"/>
+            <w:vAlign w:val="center"/>
+            <w:tcMar>
+              <w:top w:w="70" w:type="dxa"/>
+              <w:bottom w:w="70" w:type="dxa"/>
+              <w:left w:w="100" w:type="dxa"/>
+              <w:right w:w="100" w:type="dxa"/>
+            </w:tcMar>
+          </w:tcPr>
           <w:p>
             <w:pPr>
               <w:pStyle w:val="Compact"/>
-              <w:spacing w:line="264" w:lineRule="auto"/>
+              <w:keepNext/>
+              <w:widowControl/>
+              <w:spacing w:line="240" w:lineRule="auto" w:after="0"/>
               <w:ind w:firstLine="0"/>
-              <w:jc w:val="left"/>
+              <w:jc w:val="center"/>
             </w:pPr>
             <w:r>
               <w:rPr>
                 <w:rFonts w:ascii="Times New Roman" w:hAnsi="Times New Roman"/>
-                <w:sz w:val="23"/>
+                <w:b w:val="0"/>
+                <w:i w:val="0"/>
+                <w:color w:val="000000"/>
+                <w:sz w:val="24"/>
               </w:rPr>
               <w:t xml:space="preserve">W/m²</w:t>
             </w:r>
@@ -1890,52 +2867,95 @@
           <w:cantSplit/>
         </w:trPr>
         <w:tc>
-          <w:tcPr/>
+          <w:tcPr>
+            <w:tcW w:type="dxa" w:w="1531"/>
+            <w:vAlign w:val="center"/>
+            <w:tcMar>
+              <w:top w:w="70" w:type="dxa"/>
+              <w:bottom w:w="70" w:type="dxa"/>
+              <w:left w:w="100" w:type="dxa"/>
+              <w:right w:w="100" w:type="dxa"/>
+            </w:tcMar>
+          </w:tcPr>
           <w:p>
             <w:pPr>
               <w:pStyle w:val="Compact"/>
-              <w:spacing w:line="264" w:lineRule="auto"/>
+              <w:keepNext/>
+              <w:widowControl/>
+              <w:spacing w:line="240" w:lineRule="auto" w:after="0"/>
               <w:ind w:firstLine="0"/>
-              <w:jc w:val="left"/>
+              <w:jc w:val="center"/>
             </w:pPr>
             <m:oMath>
               <m:r>
+                <w:rPr>
+                  <w:sz w:val="24"/>
+                  <w:szCs w:val="24"/>
+                </w:rPr>
                 <m:t>H</m:t>
               </m:r>
             </m:oMath>
           </w:p>
         </w:tc>
         <w:tc>
-          <w:tcPr/>
+          <w:tcPr>
+            <w:tcW w:type="dxa" w:w="4535"/>
+            <w:vAlign w:val="center"/>
+            <w:tcMar>
+              <w:top w:w="70" w:type="dxa"/>
+              <w:bottom w:w="70" w:type="dxa"/>
+              <w:left w:w="100" w:type="dxa"/>
+              <w:right w:w="100" w:type="dxa"/>
+            </w:tcMar>
+          </w:tcPr>
           <w:p>
             <w:pPr>
               <w:pStyle w:val="Compact"/>
-              <w:spacing w:line="264" w:lineRule="auto"/>
+              <w:keepNext/>
+              <w:widowControl/>
+              <w:spacing w:line="240" w:lineRule="auto" w:after="0"/>
               <w:ind w:firstLine="0"/>
               <w:jc w:val="left"/>
             </w:pPr>
             <w:r>
               <w:rPr>
                 <w:rFonts w:ascii="Times New Roman" w:hAnsi="Times New Roman"/>
-                <w:sz w:val="23"/>
+                <w:b w:val="0"/>
+                <w:i w:val="0"/>
+                <w:color w:val="000000"/>
+                <w:sz w:val="24"/>
               </w:rPr>
               <w:t xml:space="preserve">Irradiação no plano e intervalo declarados</w:t>
             </w:r>
           </w:p>
         </w:tc>
         <w:tc>
-          <w:tcPr/>
+          <w:tcPr>
+            <w:tcW w:type="dxa" w:w="2551"/>
+            <w:vAlign w:val="center"/>
+            <w:tcMar>
+              <w:top w:w="70" w:type="dxa"/>
+              <w:bottom w:w="70" w:type="dxa"/>
+              <w:left w:w="100" w:type="dxa"/>
+              <w:right w:w="100" w:type="dxa"/>
+            </w:tcMar>
+          </w:tcPr>
           <w:p>
             <w:pPr>
               <w:pStyle w:val="Compact"/>
-              <w:spacing w:line="264" w:lineRule="auto"/>
+              <w:keepNext/>
+              <w:widowControl/>
+              <w:spacing w:line="240" w:lineRule="auto" w:after="0"/>
               <w:ind w:firstLine="0"/>
-              <w:jc w:val="left"/>
+              <w:jc w:val="center"/>
             </w:pPr>
             <w:r>
               <w:rPr>
                 <w:rFonts w:ascii="Times New Roman" w:hAnsi="Times New Roman"/>
-                <w:sz w:val="23"/>
+                <w:b w:val="0"/>
+                <w:i w:val="0"/>
+                <w:color w:val="000000"/>
+                <w:sz w:val="24"/>
               </w:rPr>
               <w:t xml:space="preserve">J/m², Wh/m² ou kWh/m²</w:t>
             </w:r>
@@ -1945,19 +2965,22 @@
     </w:tbl>
     <w:p>
       <w:pPr>
-        <w:pStyle w:val="BodyText"/>
+        <w:pStyle w:val="FirstParagraph"/>
+        <w:keepNext w:val="0"/>
         <w:widowControl/>
-        <w:spacing w:line="264" w:lineRule="auto"/>
-        <w:ind w:firstLine="0"/>
+        <w:spacing w:line="240" w:lineRule="auto" w:after="160" w:before="60"/>
+        <w:ind w:firstLine="0" w:left="227" w:right="227"/>
         <w:jc w:val="left"/>
       </w:pPr>
       <w:r>
         <w:rPr>
           <w:rFonts w:ascii="Times New Roman" w:hAnsi="Times New Roman"/>
-          <w:i w:val="0"/>
-          <w:sz w:val="22"/>
-        </w:rPr>
-        <w:t xml:space="preserve">Fonte: elaboração de Samuel Constantino Teixeira a partir de Duffie, Beckman e Blair (2020, p. 9–15) e Sengupta et al. (2024, cap. 2, p. 9–11).</w:t>
+          <w:b w:val="0"/>
+          <w:i w:val="0"/>
+          <w:color w:val="000000"/>
+          <w:sz w:val="20"/>
+        </w:rPr>
+        <w:t xml:space="preserve">Fonte: elaborado pelo autor, com base em Duffie, Beckman e Blair (2020) e Sengupta et al. (2024).</w:t>
       </w:r>
     </w:p>
     <w:bookmarkEnd w:id="22"/>
@@ -1965,11 +2988,18 @@
     <w:p>
       <w:pPr>
         <w:pStyle w:val="Heading2"/>
+        <w:keepNext/>
         <w:widowControl/>
+        <w:spacing w:line="360" w:lineRule="auto" w:after="120"/>
+        <w:ind w:firstLine="0"/>
       </w:pPr>
       <w:r>
         <w:rPr>
+          <w:rFonts w:ascii="Times New Roman" w:hAnsi="Times New Roman"/>
           <w:b/>
+          <w:i w:val="0"/>
+          <w:color w:val="000000"/>
+          <w:sz w:val="24"/>
         </w:rPr>
         <w:t>1.2.4 APLICAÇÃO AO PVDAQ 2107 E CONTINUIDADE</w:t>
       </w:r>
@@ -1978,11 +3008,15 @@
       <w:pPr>
         <w:pStyle w:val="FirstParagraph"/>
         <w:widowControl/>
+        <w:spacing w:line="360" w:lineRule="auto" w:after="120"/>
+        <w:ind w:firstLine="709"/>
       </w:pPr>
       <w:r>
         <w:rPr>
           <w:rFonts w:ascii="Times New Roman" w:hAnsi="Times New Roman"/>
           <w:i w:val="0"/>
+          <w:color w:val="000000"/>
+          <w:sz w:val="24"/>
         </w:rPr>
         <w:t xml:space="preserve">No conjunto utilizado pelo capítulo, a POA observada constitui a entrada radiométrica local da cadeia principal. O arquivo preparado preserva o início de cada intervalo em UTC e um indicador da presença das três amostras previstas na agregação de 15 minutos. A posição solar é calculada no ponto médio, enquanto a POA conserva a natureza de média do intervalo. A Figura G01, discutida em 1.1, apresenta essas informações com suas diferentes origens explicitadas. Esse procedimento permite relacionar geometria e observação sem transformar o sensor POA em um sensor horizontal.</w:t>
       </w:r>
@@ -1991,11 +3025,15 @@
       <w:pPr>
         <w:pStyle w:val="BodyText"/>
         <w:widowControl/>
+        <w:spacing w:line="360" w:lineRule="auto" w:after="120"/>
+        <w:ind w:firstLine="709"/>
       </w:pPr>
       <w:r>
         <w:rPr>
           <w:rFonts w:ascii="Times New Roman" w:hAnsi="Times New Roman"/>
           <w:i w:val="0"/>
+          <w:color w:val="000000"/>
+          <w:sz w:val="24"/>
         </w:rPr>
         <w:t xml:space="preserve">As componentes GHI, DNI e DHI eventualmente reconstruídas a partir da POA permanecem estimativas dependentes de modelos e hipóteses. A reprodução da POA de entrada por uma transposição inversa seguida da transposição direta não constitui validação independente dessas componentes. Essa conclusão resulta da dependência entre entradas e saídas do procedimento, e não de uma comparação realizada com sensores locais adicionais. Driesse, Jensen e Perez (2024, p. 9–11) distinguem a avaliação do algoritmo inverso com alvos de irradiância inclinada modelados da avaliação com medições reais; também discutem soluções matemáticas múltiplas. A verificação das componentes do PVDAQ exigiria referências observacionais ou estimativas externas com incerteza e independência documentadas.</w:t>
       </w:r>
@@ -2004,11 +3042,15 @@
       <w:pPr>
         <w:pStyle w:val="BodyText"/>
         <w:widowControl/>
+        <w:spacing w:line="360" w:lineRule="auto" w:after="120"/>
+        <w:ind w:firstLine="709"/>
       </w:pPr>
       <w:r>
         <w:rPr>
           <w:rFonts w:ascii="Times New Roman" w:hAnsi="Times New Roman"/>
           <w:i w:val="0"/>
+          <w:color w:val="000000"/>
+          <w:sz w:val="24"/>
         </w:rPr>
         <w:t xml:space="preserve">A distinção entre potência radiativa, energia integrada e planos de recepção prepara a análise da modulação atmosférica em 1.3. Ela também define o requisito de comparabilidade para 1.4: duas séries somente podem ser confrontadas após compatibilizar a grandeza, o plano, o tempo de integração e o domínio de observação.</w:t>
       </w:r>
@@ -2019,11 +3061,18 @@
     <w:p>
       <w:pPr>
         <w:pStyle w:val="Heading1"/>
+        <w:keepNext/>
         <w:widowControl/>
+        <w:spacing w:line="360" w:lineRule="auto" w:after="120"/>
+        <w:ind w:firstLine="0"/>
       </w:pPr>
       <w:r>
         <w:rPr>
+          <w:rFonts w:ascii="Times New Roman" w:hAnsi="Times New Roman"/>
           <w:b/>
+          <w:i w:val="0"/>
+          <w:color w:val="000000"/>
+          <w:sz w:val="24"/>
         </w:rPr>
         <w:t>REFERÊNCIAS</w:t>
       </w:r>
@@ -2032,14 +3081,16 @@
       <w:pPr>
         <w:pStyle w:val="FirstParagraph"/>
         <w:widowControl/>
-        <w:spacing w:line="264" w:lineRule="auto"/>
-        <w:ind w:hanging="340" w:left="340"/>
+        <w:spacing w:line="240" w:lineRule="auto" w:after="120"/>
+        <w:ind w:left="340" w:hanging="340"/>
         <w:jc w:val="left"/>
       </w:pPr>
       <w:r>
         <w:rPr>
           <w:rFonts w:ascii="Times New Roman" w:hAnsi="Times New Roman"/>
           <w:i w:val="0"/>
+          <w:color w:val="000000"/>
+          <w:sz w:val="24"/>
         </w:rPr>
         <w:t xml:space="preserve">DRIESSE, Anton; JENSEN, Adam R.; PEREZ, Richard. A continuous form of the Perez diffuse sky model for forward and reverse transposition.</w:t>
       </w:r>
@@ -2047,6 +3098,8 @@
         <w:rPr>
           <w:rFonts w:ascii="Times New Roman" w:hAnsi="Times New Roman"/>
           <w:i w:val="0"/>
+          <w:color w:val="000000"/>
+          <w:sz w:val="24"/>
         </w:rPr>
         <w:t xml:space="preserve"> </w:t>
       </w:r>
@@ -2056,6 +3109,8 @@
           <w:rFonts w:ascii="Times New Roman" w:hAnsi="Times New Roman"/>
           <w:b/>
           <w:i w:val="0"/>
+          <w:color w:val="000000"/>
+          <w:sz w:val="24"/>
         </w:rPr>
         <w:t xml:space="preserve">Solar Energy</w:t>
       </w:r>
@@ -2063,6 +3118,8 @@
         <w:rPr>
           <w:rFonts w:ascii="Times New Roman" w:hAnsi="Times New Roman"/>
           <w:i w:val="0"/>
+          <w:color w:val="000000"/>
+          <w:sz w:val="24"/>
         </w:rPr>
         <w:t xml:space="preserve">, v. 267, art. 112093, 2024. DOI: https://doi.org/10.1016/j.solener.2023.112093.</w:t>
       </w:r>
@@ -2071,14 +3128,16 @@
       <w:pPr>
         <w:pStyle w:val="BodyText"/>
         <w:widowControl/>
-        <w:spacing w:line="264" w:lineRule="auto"/>
-        <w:ind w:hanging="340" w:left="340"/>
+        <w:spacing w:line="240" w:lineRule="auto" w:after="120"/>
+        <w:ind w:left="340" w:hanging="340"/>
         <w:jc w:val="left"/>
       </w:pPr>
       <w:r>
         <w:rPr>
           <w:rFonts w:ascii="Times New Roman" w:hAnsi="Times New Roman"/>
           <w:i w:val="0"/>
+          <w:color w:val="000000"/>
+          <w:sz w:val="24"/>
         </w:rPr>
         <w:t xml:space="preserve">DUFFIE, John A.; BECKMAN, William A.; BLAIR, Nathan.</w:t>
       </w:r>
@@ -2086,6 +3145,8 @@
         <w:rPr>
           <w:rFonts w:ascii="Times New Roman" w:hAnsi="Times New Roman"/>
           <w:i w:val="0"/>
+          <w:color w:val="000000"/>
+          <w:sz w:val="24"/>
         </w:rPr>
         <w:t xml:space="preserve"> </w:t>
       </w:r>
@@ -2095,6 +3156,8 @@
           <w:rFonts w:ascii="Times New Roman" w:hAnsi="Times New Roman"/>
           <w:b/>
           <w:i w:val="0"/>
+          <w:color w:val="000000"/>
+          <w:sz w:val="24"/>
         </w:rPr>
         <w:t xml:space="preserve">Solar engineering of thermal processes, photovoltaics and wind</w:t>
       </w:r>
@@ -2102,6 +3165,8 @@
         <w:rPr>
           <w:rFonts w:ascii="Times New Roman" w:hAnsi="Times New Roman"/>
           <w:i w:val="0"/>
+          <w:color w:val="000000"/>
+          <w:sz w:val="24"/>
         </w:rPr>
         <w:t xml:space="preserve">. 5. ed. Hoboken: Wiley, 2020. ISBN 9781119540311. DOI: https://doi.org/10.1002/9781119540328.</w:t>
       </w:r>
@@ -2110,14 +3175,16 @@
       <w:pPr>
         <w:pStyle w:val="BodyText"/>
         <w:widowControl/>
-        <w:spacing w:line="264" w:lineRule="auto"/>
-        <w:ind w:hanging="340" w:left="340"/>
+        <w:spacing w:line="240" w:lineRule="auto" w:after="120"/>
+        <w:ind w:left="340" w:hanging="340"/>
         <w:jc w:val="left"/>
       </w:pPr>
       <w:r>
         <w:rPr>
           <w:rFonts w:ascii="Times New Roman" w:hAnsi="Times New Roman"/>
           <w:i w:val="0"/>
+          <w:color w:val="000000"/>
+          <w:sz w:val="24"/>
         </w:rPr>
         <w:t xml:space="preserve">SENGUPTA, Manajit et al. (ed.).</w:t>
       </w:r>
@@ -2125,6 +3192,8 @@
         <w:rPr>
           <w:rFonts w:ascii="Times New Roman" w:hAnsi="Times New Roman"/>
           <w:i w:val="0"/>
+          <w:color w:val="000000"/>
+          <w:sz w:val="24"/>
         </w:rPr>
         <w:t xml:space="preserve"> </w:t>
       </w:r>
@@ -2134,6 +3203,8 @@
           <w:rFonts w:ascii="Times New Roman" w:hAnsi="Times New Roman"/>
           <w:b/>
           <w:i w:val="0"/>
+          <w:color w:val="000000"/>
+          <w:sz w:val="24"/>
         </w:rPr>
         <w:t xml:space="preserve">Best practices handbook for the collection and use of solar resource data for solar energy applications</w:t>
       </w:r>
@@ -2141,6 +3212,8 @@
         <w:rPr>
           <w:rFonts w:ascii="Times New Roman" w:hAnsi="Times New Roman"/>
           <w:i w:val="0"/>
+          <w:color w:val="000000"/>
+          <w:sz w:val="24"/>
         </w:rPr>
         <w:t xml:space="preserve">. 4. ed. Golden: National Renewable Energy Laboratory, 2024. Relatório NREL/TP-5D00-88300. DOI: https://doi.org/10.2172/2448063. Disponível em: https://docs.nrel.gov/docs/fy24osti/88300.pdf. Acesso em: 27 out. 2026.</w:t>
       </w:r>
@@ -2149,14 +3222,16 @@
       <w:pPr>
         <w:pStyle w:val="BodyText"/>
         <w:widowControl/>
-        <w:spacing w:line="264" w:lineRule="auto"/>
-        <w:ind w:hanging="340" w:left="340"/>
+        <w:spacing w:line="240" w:lineRule="auto" w:after="120"/>
+        <w:ind w:left="340" w:hanging="340"/>
         <w:jc w:val="left"/>
       </w:pPr>
       <w:r>
         <w:rPr>
           <w:rFonts w:ascii="Times New Roman" w:hAnsi="Times New Roman"/>
           <w:i w:val="0"/>
+          <w:color w:val="000000"/>
+          <w:sz w:val="24"/>
         </w:rPr>
         <w:t xml:space="preserve">TEIXEIRA, Samuel Constantino et al. </w:t>
       </w:r>
@@ -2166,6 +3241,8 @@
           <w:rFonts w:ascii="Times New Roman" w:hAnsi="Times New Roman"/>
           <w:b/>
           <w:i w:val="0"/>
+          <w:color w:val="000000"/>
+          <w:sz w:val="24"/>
         </w:rPr>
         <w:t xml:space="preserve">SPGER0046 Energias Renováveis: configuração e dados preparados do estudo PVDAQ 2107</w:t>
       </w:r>
@@ -2173,6 +3250,8 @@
         <w:rPr>
           <w:rFonts w:ascii="Times New Roman" w:hAnsi="Times New Roman"/>
           <w:i w:val="0"/>
+          <w:color w:val="000000"/>
+          <w:sz w:val="24"/>
         </w:rPr>
         <w:t xml:space="preserve">. 2026. Repositório de trabalho. Dados utilizados: abril a junho de 2024. Disponível em: https://github.com/samuelasroma-byte/SPGER0046_Energias_Renovaveis. Acesso em: 27 out. 2026.</w:t>
       </w:r>
@@ -2221,7 +3300,7 @@
     <w:r>
       <w:rPr>
         <w:rFonts w:ascii="Times New Roman" w:hAnsi="Times New Roman"/>
-        <w:sz w:val="22"/>
+        <w:sz w:val="20"/>
       </w:rPr>
     </w:r>
     <w:fldSimple w:instr="PAGE"/>
@@ -2335,14 +3414,15 @@
     <w:name w:val="Normal"/>
     <w:qFormat/>
     <w:pPr>
-      <w:spacing w:after="140" w:line="324" w:lineRule="auto"/>
+      <w:spacing w:after="140" w:line="360" w:lineRule="auto"/>
       <w:ind w:firstLine="709"/>
       <w:jc w:val="both"/>
     </w:pPr>
     <w:rPr>
       <w:rFonts w:ascii="Times New Roman" w:hAnsi="Times New Roman"/>
+      <w:i w:val="0"/>
       <w:color w:val="000000"/>
-      <w:sz w:val="28"/>
+      <w:sz w:val="24"/>
     </w:rPr>
   </w:style>
   <w:style w:styleId="BodyText" w:type="paragraph">
@@ -2351,14 +3431,15 @@
     <w:link w:val="BodyTextChar"/>
     <w:qFormat/>
     <w:pPr>
-      <w:spacing w:after="140" w:before="180" w:line="324" w:lineRule="auto"/>
+      <w:spacing w:after="140" w:before="180" w:line="360" w:lineRule="auto"/>
       <w:ind w:firstLine="709"/>
       <w:jc w:val="both"/>
     </w:pPr>
     <w:rPr>
       <w:rFonts w:ascii="Times New Roman" w:hAnsi="Times New Roman"/>
+      <w:i w:val="0"/>
       <w:color w:val="000000"/>
-      <w:sz w:val="28"/>
+      <w:sz w:val="24"/>
     </w:rPr>
   </w:style>
   <w:style w:customStyle="1" w:styleId="FirstParagraph" w:type="paragraph">
@@ -2367,14 +3448,15 @@
     <w:next w:val="BodyText"/>
     <w:qFormat/>
     <w:pPr>
-      <w:spacing w:after="140" w:line="324" w:lineRule="auto"/>
+      <w:spacing w:after="140" w:line="360" w:lineRule="auto"/>
       <w:ind w:firstLine="709"/>
       <w:jc w:val="both"/>
     </w:pPr>
     <w:rPr>
       <w:rFonts w:ascii="Times New Roman" w:hAnsi="Times New Roman"/>
+      <w:i w:val="0"/>
       <w:color w:val="000000"/>
-      <w:sz w:val="28"/>
+      <w:sz w:val="24"/>
     </w:rPr>
   </w:style>
   <w:style w:customStyle="1" w:styleId="Compact" w:type="paragraph">
@@ -2403,7 +3485,7 @@
       <w:bCs/>
       <w:i w:val="0"/>
       <w:color w:val="000000"/>
-      <w:sz w:val="32"/>
+      <w:sz w:val="24"/>
       <w:szCs w:val="36"/>
     </w:rPr>
   </w:style>
@@ -3085,7 +4167,7 @@
       <w:b/>
       <w:i w:val="0"/>
       <w:color w:val="000000"/>
-      <w:sz w:val="32"/>
+      <w:sz w:val="24"/>
     </w:rPr>
   </w:style>
   <w:style w:customStyle="1" w:styleId="Heading2" w:type="paragraph">
@@ -3100,7 +4182,7 @@
       <w:b/>
       <w:i w:val="0"/>
       <w:color w:val="000000"/>
-      <w:sz w:val="28"/>
+      <w:sz w:val="24"/>
     </w:rPr>
   </w:style>
   <w:style w:customStyle="1" w:styleId="Heading3" w:type="paragraph">
@@ -3115,7 +4197,7 @@
       <w:b/>
       <w:i w:val="0"/>
       <w:color w:val="000000"/>
-      <w:sz w:val="28"/>
+      <w:sz w:val="24"/>
     </w:rPr>
   </w:style>
 </w:styles>

</xml_diff>